<commit_message>
Update Acknowledgements: add supervisor Dr. Htay Htay Yi and teachers Dr. Thiri Thitsar Khaing, Dr. Thu Zar San
</commit_message>
<xml_diff>
--- a/AEGIS_SOC_Dashboard_Project_Book.docx
+++ b/AEGIS_SOC_Dashboard_Project_Book.docx
@@ -274,7 +274,33 @@
           <w:rFonts w:ascii="Times New Roman" w:hAnsi="Times New Roman"/>
           <w:sz w:val="24"/>
         </w:rPr>
-        <w:t>First and foremost, I would like to express my sincere gratitude to my supervisor and all the lecturers of the Department for their invaluable guidance, encouragement, and support throughout the development of this project.</w:t>
+        <w:t>First and foremost, I would like to express my deepest and most sincere gratitude to my project supervisor, Dr. Htay Htay Yi, for her exceptional guidance, continuous encouragement, and invaluable technical insights throughout every phase of this project. Her constructive feedback and unwavering support were instrumental in shaping the direction and quality of this work.</w:t>
+      </w:r>
+    </w:p>
+    <w:p>
+      <w:pPr>
+        <w:spacing w:after="120" w:line="360" w:lineRule="exact"/>
+        <w:ind w:firstLine="709"/>
+      </w:pPr>
+      <w:r>
+        <w:rPr>
+          <w:rFonts w:ascii="Times New Roman" w:hAnsi="Times New Roman"/>
+          <w:sz w:val="24"/>
+        </w:rPr>
+        <w:t>I am also profoundly grateful to Dr. Thiri Thitsar Khaing for her dedicated teaching, academic mentorship, and patient guidance in helping me understand the theoretical foundations of network security and system design that underpin this project.</w:t>
+      </w:r>
+    </w:p>
+    <w:p>
+      <w:pPr>
+        <w:spacing w:after="120" w:line="360" w:lineRule="exact"/>
+        <w:ind w:firstLine="709"/>
+      </w:pPr>
+      <w:r>
+        <w:rPr>
+          <w:rFonts w:ascii="Times New Roman" w:hAnsi="Times New Roman"/>
+          <w:sz w:val="24"/>
+        </w:rPr>
+        <w:t>My sincere appreciation also goes to Dr. Thu Zar San for her thoughtful advice, encouragement throughout the research process, and for sharing her expertise in cybersecurity concepts and best practices that greatly enriched the depth and rigor of this work.</w:t>
       </w:r>
     </w:p>
     <w:p>

</xml_diff>

<commit_message>
Update project book with user-provided images and research methodology
</commit_message>
<xml_diff>
--- a/AEGIS_SOC_Dashboard_Project_Book.docx
+++ b/AEGIS_SOC_Dashboard_Project_Book.docx
@@ -706,6 +706,34 @@
         <w:t>4</w:t>
       </w:r>
     </w:p>
+    <w:p>
+      <w:pPr>
+        <w:spacing w:after="40"/>
+      </w:pPr>
+      <w:r>
+        <w:rPr>
+          <w:rFonts w:ascii="Times New Roman" w:hAnsi="Times New Roman"/>
+          <w:b w:val="0"/>
+          <w:sz w:val="22"/>
+        </w:rPr>
+        <w:t xml:space="preserve">  1.6  Research Methodology</w:t>
+      </w:r>
+      <w:r>
+        <w:rPr>
+          <w:rFonts w:ascii="Times New Roman" w:hAnsi="Times New Roman"/>
+          <w:sz w:val="22"/>
+        </w:rPr>
+        <w:t xml:space="preserve"> ..................................... </w:t>
+      </w:r>
+      <w:r>
+        <w:rPr>
+          <w:rFonts w:ascii="Times New Roman" w:hAnsi="Times New Roman"/>
+          <w:b w:val="0"/>
+          <w:sz w:val="22"/>
+        </w:rPr>
+        <w:t>4</w:t>
+      </w:r>
+    </w:p>
     <w:p/>
     <w:p>
       <w:pPr>
@@ -1663,6 +1691,62 @@
         <w:t>51</w:t>
       </w:r>
     </w:p>
+    <w:p>
+      <w:pPr>
+        <w:spacing w:after="40"/>
+      </w:pPr>
+      <w:r>
+        <w:rPr>
+          <w:rFonts w:ascii="Times New Roman" w:hAnsi="Times New Roman"/>
+          <w:b w:val="0"/>
+          <w:sz w:val="22"/>
+        </w:rPr>
+        <w:t xml:space="preserve">  6.3  Ethical Considerations and Data Privacy</w:t>
+      </w:r>
+      <w:r>
+        <w:rPr>
+          <w:rFonts w:ascii="Times New Roman" w:hAnsi="Times New Roman"/>
+          <w:sz w:val="22"/>
+        </w:rPr>
+        <w:t xml:space="preserve"> ................. </w:t>
+      </w:r>
+      <w:r>
+        <w:rPr>
+          <w:rFonts w:ascii="Times New Roman" w:hAnsi="Times New Roman"/>
+          <w:b w:val="0"/>
+          <w:sz w:val="22"/>
+        </w:rPr>
+        <w:t>52</w:t>
+      </w:r>
+    </w:p>
+    <w:p>
+      <w:pPr>
+        <w:spacing w:after="40"/>
+      </w:pPr>
+      <w:r>
+        <w:rPr>
+          <w:rFonts w:ascii="Times New Roman" w:hAnsi="Times New Roman"/>
+          <w:b w:val="0"/>
+          <w:sz w:val="22"/>
+        </w:rPr>
+        <w:t xml:space="preserve">  6.4  Scalability and Maintenance</w:t>
+      </w:r>
+      <w:r>
+        <w:rPr>
+          <w:rFonts w:ascii="Times New Roman" w:hAnsi="Times New Roman"/>
+          <w:sz w:val="22"/>
+        </w:rPr>
+        <w:t xml:space="preserve"> ............................. </w:t>
+      </w:r>
+      <w:r>
+        <w:rPr>
+          <w:rFonts w:ascii="Times New Roman" w:hAnsi="Times New Roman"/>
+          <w:b w:val="0"/>
+          <w:sz w:val="22"/>
+        </w:rPr>
+        <w:t>53</w:t>
+      </w:r>
+    </w:p>
     <w:p/>
     <w:p>
       <w:pPr>
@@ -1689,7 +1773,7 @@
           <w:b/>
           <w:sz w:val="22"/>
         </w:rPr>
-        <w:t>52</w:t>
+        <w:t>54</w:t>
       </w:r>
     </w:p>
     <w:p/>
@@ -2535,6 +2619,25 @@
           <w:sz w:val="22"/>
         </w:rPr>
         <w:t xml:space="preserve"> ...................... 51</w:t>
+      </w:r>
+    </w:p>
+    <w:p>
+      <w:pPr>
+        <w:spacing w:after="40"/>
+      </w:pPr>
+      <w:r>
+        <w:rPr>
+          <w:rFonts w:ascii="Times New Roman" w:hAnsi="Times New Roman"/>
+          <w:sz w:val="22"/>
+        </w:rPr>
+        <w:t>Table 6.3  Data Retention Policy</w:t>
+      </w:r>
+      <w:r>
+        <w:rPr>
+          <w:rFonts w:ascii="Times New Roman" w:hAnsi="Times New Roman"/>
+          <w:sz w:val="22"/>
+        </w:rPr>
+        <w:t xml:space="preserve"> ............................ 52</w:t>
       </w:r>
     </w:p>
     <w:p>
@@ -4761,6 +4864,112 @@
           <w:sz w:val="22"/>
         </w:rPr>
         <w:t>Appendices provide installation, API, and configuration references.</w:t>
+      </w:r>
+    </w:p>
+    <w:p>
+      <w:pPr>
+        <w:pStyle w:val="Heading2"/>
+        <w:spacing w:before="240" w:after="120"/>
+      </w:pPr>
+      <w:r>
+        <w:t>1.6  Research Methodology</w:t>
+      </w:r>
+    </w:p>
+    <w:p>
+      <w:pPr>
+        <w:spacing w:after="120" w:line="360" w:lineRule="exact"/>
+        <w:ind w:firstLine="709"/>
+      </w:pPr>
+      <w:r>
+        <w:rPr>
+          <w:rFonts w:ascii="Times New Roman" w:hAnsi="Times New Roman"/>
+          <w:sz w:val="24"/>
+        </w:rPr>
+        <w:t>The development of AEGIS followed a structured research and development methodology to ensure technical rigor and system reliability:</w:t>
+      </w:r>
+    </w:p>
+    <w:p>
+      <w:pPr>
+        <w:pStyle w:val="ListBullet"/>
+        <w:spacing w:after="60"/>
+        <w:ind w:left="709"/>
+      </w:pPr>
+      <w:r>
+        <w:rPr>
+          <w:rFonts w:ascii="Times New Roman" w:hAnsi="Times New Roman"/>
+          <w:sz w:val="22"/>
+        </w:rPr>
+        <w:t>Phase 1: Literature Review — Analyzing existing SOC/SIEM architectures and open-source security tools.</w:t>
+      </w:r>
+    </w:p>
+    <w:p>
+      <w:pPr>
+        <w:pStyle w:val="ListBullet"/>
+        <w:spacing w:after="60"/>
+        <w:ind w:left="709"/>
+      </w:pPr>
+      <w:r>
+        <w:rPr>
+          <w:rFonts w:ascii="Times New Roman" w:hAnsi="Times New Roman"/>
+          <w:sz w:val="22"/>
+        </w:rPr>
+        <w:t>Phase 2: Requirements Analysis — Defining functional and non-functional needs for a mid-sized corporate lab.</w:t>
+      </w:r>
+    </w:p>
+    <w:p>
+      <w:pPr>
+        <w:pStyle w:val="ListBullet"/>
+        <w:spacing w:after="60"/>
+        <w:ind w:left="709"/>
+      </w:pPr>
+      <w:r>
+        <w:rPr>
+          <w:rFonts w:ascii="Times New Roman" w:hAnsi="Times New Roman"/>
+          <w:sz w:val="22"/>
+        </w:rPr>
+        <w:t>Phase 3: Network Design — Designing a multi-zone GNS3 topology with DMZ, Internal, and Management VLANs.</w:t>
+      </w:r>
+    </w:p>
+    <w:p>
+      <w:pPr>
+        <w:pStyle w:val="ListBullet"/>
+        <w:spacing w:after="60"/>
+        <w:ind w:left="709"/>
+      </w:pPr>
+      <w:r>
+        <w:rPr>
+          <w:rFonts w:ascii="Times New Roman" w:hAnsi="Times New Roman"/>
+          <w:sz w:val="22"/>
+        </w:rPr>
+        <w:t>Phase 4: Implementation — Developing the full-stack dashboard, API server, and Python forwarder agent.</w:t>
+      </w:r>
+    </w:p>
+    <w:p>
+      <w:pPr>
+        <w:pStyle w:val="ListBullet"/>
+        <w:spacing w:after="60"/>
+        <w:ind w:left="709"/>
+      </w:pPr>
+      <w:r>
+        <w:rPr>
+          <w:rFonts w:ascii="Times New Roman" w:hAnsi="Times New Roman"/>
+          <w:sz w:val="22"/>
+        </w:rPr>
+        <w:t>Phase 5: Integration — Connecting the GNS3 virtual machines to the cloud-hosted AEGIS platform.</w:t>
+      </w:r>
+    </w:p>
+    <w:p>
+      <w:pPr>
+        <w:pStyle w:val="ListBullet"/>
+        <w:spacing w:after="60"/>
+        <w:ind w:left="709"/>
+      </w:pPr>
+      <w:r>
+        <w:rPr>
+          <w:rFonts w:ascii="Times New Roman" w:hAnsi="Times New Roman"/>
+          <w:sz w:val="22"/>
+        </w:rPr>
+        <w:t>Phase 6: Testing and Evaluation — Simulating real-world attacks using Kali Linux and validating the auto-defense response.</w:t>
       </w:r>
     </w:p>
     <w:p>
@@ -6890,6 +7099,59 @@
     </w:p>
     <w:p>
       <w:pPr>
+        <w:jc w:val="center"/>
+      </w:pPr>
+      <w:r>
+        <w:drawing>
+          <wp:inline xmlns:a="http://schemas.openxmlformats.org/drawingml/2006/main" xmlns:pic="http://schemas.openxmlformats.org/drawingml/2006/picture">
+            <wp:extent cx="5400000" cy="2934423"/>
+            <wp:docPr id="1" name="Picture 1"/>
+            <wp:cNvGraphicFramePr>
+              <a:graphicFrameLocks noChangeAspect="1"/>
+            </wp:cNvGraphicFramePr>
+            <a:graphic>
+              <a:graphicData uri="http://schemas.openxmlformats.org/drawingml/2006/picture">
+                <pic:pic>
+                  <pic:nvPicPr>
+                    <pic:cNvPr id="0" name="pasted_file_EPUsdN_image.png"/>
+                    <pic:cNvPicPr/>
+                  </pic:nvPicPr>
+                  <pic:blipFill>
+                    <a:blip r:embed="rId9"/>
+                    <a:stretch>
+                      <a:fillRect/>
+                    </a:stretch>
+                  </pic:blipFill>
+                  <pic:spPr>
+                    <a:xfrm>
+                      <a:off x="0" y="0"/>
+                      <a:ext cx="5400000" cy="2934423"/>
+                    </a:xfrm>
+                    <a:prstGeom prst="rect"/>
+                  </pic:spPr>
+                </pic:pic>
+              </a:graphicData>
+            </a:graphic>
+          </wp:inline>
+        </w:drawing>
+      </w:r>
+    </w:p>
+    <w:p>
+      <w:pPr>
+        <w:spacing w:after="160"/>
+        <w:jc w:val="center"/>
+      </w:pPr>
+      <w:r>
+        <w:rPr>
+          <w:rFonts w:ascii="Times New Roman" w:hAnsi="Times New Roman"/>
+          <w:i/>
+          <w:sz w:val="20"/>
+        </w:rPr>
+        <w:t>Figure 3.2: GNS3 Network Topology Diagram</w:t>
+      </w:r>
+    </w:p>
+    <w:p>
+      <w:pPr>
         <w:pStyle w:val="Heading2"/>
         <w:spacing w:before="240" w:after="120"/>
       </w:pPr>
@@ -8962,6 +9224,59 @@
           <w:sz w:val="24"/>
         </w:rPr>
         <w:t>The GNS3 topology (v4 Final, July 2026) consists of the following nodes connected through virtual switches:</w:t>
+      </w:r>
+    </w:p>
+    <w:p>
+      <w:pPr>
+        <w:jc w:val="center"/>
+      </w:pPr>
+      <w:r>
+        <w:drawing>
+          <wp:inline xmlns:a="http://schemas.openxmlformats.org/drawingml/2006/main" xmlns:pic="http://schemas.openxmlformats.org/drawingml/2006/picture">
+            <wp:extent cx="5400000" cy="2934423"/>
+            <wp:docPr id="2" name="Picture 2"/>
+            <wp:cNvGraphicFramePr>
+              <a:graphicFrameLocks noChangeAspect="1"/>
+            </wp:cNvGraphicFramePr>
+            <a:graphic>
+              <a:graphicData uri="http://schemas.openxmlformats.org/drawingml/2006/picture">
+                <pic:pic>
+                  <pic:nvPicPr>
+                    <pic:cNvPr id="0" name="pasted_file_EPUsdN_image.png"/>
+                    <pic:cNvPicPr/>
+                  </pic:nvPicPr>
+                  <pic:blipFill>
+                    <a:blip r:embed="rId9"/>
+                    <a:stretch>
+                      <a:fillRect/>
+                    </a:stretch>
+                  </pic:blipFill>
+                  <pic:spPr>
+                    <a:xfrm>
+                      <a:off x="0" y="0"/>
+                      <a:ext cx="5400000" cy="2934423"/>
+                    </a:xfrm>
+                    <a:prstGeom prst="rect"/>
+                  </pic:spPr>
+                </pic:pic>
+              </a:graphicData>
+            </a:graphic>
+          </wp:inline>
+        </w:drawing>
+      </w:r>
+    </w:p>
+    <w:p>
+      <w:pPr>
+        <w:spacing w:after="160"/>
+        <w:jc w:val="center"/>
+      </w:pPr>
+      <w:r>
+        <w:rPr>
+          <w:rFonts w:ascii="Times New Roman" w:hAnsi="Times New Roman"/>
+          <w:i/>
+          <w:sz w:val="20"/>
+        </w:rPr>
+        <w:t>Figure 4.1: GNS3 Topology — v4 Final Layout</w:t>
       </w:r>
     </w:p>
     <w:tbl>
@@ -9944,6 +10259,59 @@
           <w:sz w:val="24"/>
         </w:rPr>
         <w:t>The web application intentionally includes a login form vulnerable to SQL injection and brute force attacks for demonstration purposes. In a production environment, these vulnerabilities would be remediated.</w:t>
+      </w:r>
+    </w:p>
+    <w:p>
+      <w:pPr>
+        <w:jc w:val="center"/>
+      </w:pPr>
+      <w:r>
+        <w:drawing>
+          <wp:inline xmlns:a="http://schemas.openxmlformats.org/drawingml/2006/main" xmlns:pic="http://schemas.openxmlformats.org/drawingml/2006/picture">
+            <wp:extent cx="5400000" cy="2982688"/>
+            <wp:docPr id="3" name="Picture 3"/>
+            <wp:cNvGraphicFramePr>
+              <a:graphicFrameLocks noChangeAspect="1"/>
+            </wp:cNvGraphicFramePr>
+            <a:graphic>
+              <a:graphicData uri="http://schemas.openxmlformats.org/drawingml/2006/picture">
+                <pic:pic>
+                  <pic:nvPicPr>
+                    <pic:cNvPr id="0" name="pasted_file_27v0Ix_image.png"/>
+                    <pic:cNvPicPr/>
+                  </pic:nvPicPr>
+                  <pic:blipFill>
+                    <a:blip r:embed="rId10"/>
+                    <a:stretch>
+                      <a:fillRect/>
+                    </a:stretch>
+                  </pic:blipFill>
+                  <pic:spPr>
+                    <a:xfrm>
+                      <a:off x="0" y="0"/>
+                      <a:ext cx="5400000" cy="2982688"/>
+                    </a:xfrm>
+                    <a:prstGeom prst="rect"/>
+                  </pic:spPr>
+                </pic:pic>
+              </a:graphicData>
+            </a:graphic>
+          </wp:inline>
+        </w:drawing>
+      </w:r>
+    </w:p>
+    <w:p>
+      <w:pPr>
+        <w:spacing w:after="160"/>
+        <w:jc w:val="center"/>
+      </w:pPr>
+      <w:r>
+        <w:rPr>
+          <w:rFonts w:ascii="Times New Roman" w:hAnsi="Times New Roman"/>
+          <w:i/>
+          <w:sz w:val="20"/>
+        </w:rPr>
+        <w:t>Figure 4.3: Company Web Server Apache2 Setup</w:t>
       </w:r>
     </w:p>
     <w:p>
@@ -10001,6 +10369,59 @@
     </w:p>
     <w:p>
       <w:pPr>
+        <w:jc w:val="center"/>
+      </w:pPr>
+      <w:r>
+        <w:drawing>
+          <wp:inline xmlns:a="http://schemas.openxmlformats.org/drawingml/2006/main" xmlns:pic="http://schemas.openxmlformats.org/drawingml/2006/picture">
+            <wp:extent cx="5400000" cy="2980567"/>
+            <wp:docPr id="4" name="Picture 4"/>
+            <wp:cNvGraphicFramePr>
+              <a:graphicFrameLocks noChangeAspect="1"/>
+            </wp:cNvGraphicFramePr>
+            <a:graphic>
+              <a:graphicData uri="http://schemas.openxmlformats.org/drawingml/2006/picture">
+                <pic:pic>
+                  <pic:nvPicPr>
+                    <pic:cNvPr id="0" name="pasted_file_ZoNHl2_image.png"/>
+                    <pic:cNvPicPr/>
+                  </pic:nvPicPr>
+                  <pic:blipFill>
+                    <a:blip r:embed="rId11"/>
+                    <a:stretch>
+                      <a:fillRect/>
+                    </a:stretch>
+                  </pic:blipFill>
+                  <pic:spPr>
+                    <a:xfrm>
+                      <a:off x="0" y="0"/>
+                      <a:ext cx="5400000" cy="2980567"/>
+                    </a:xfrm>
+                    <a:prstGeom prst="rect"/>
+                  </pic:spPr>
+                </pic:pic>
+              </a:graphicData>
+            </a:graphic>
+          </wp:inline>
+        </w:drawing>
+      </w:r>
+    </w:p>
+    <w:p>
+      <w:pPr>
+        <w:spacing w:after="160"/>
+        <w:jc w:val="center"/>
+      </w:pPr>
+      <w:r>
+        <w:rPr>
+          <w:rFonts w:ascii="Times New Roman" w:hAnsi="Times New Roman"/>
+          <w:i/>
+          <w:sz w:val="20"/>
+        </w:rPr>
+        <w:t>Figure 4.4: BIND9 DNS Zone Configuration</w:t>
+      </w:r>
+    </w:p>
+    <w:p>
+      <w:pPr>
         <w:pStyle w:val="Heading3"/>
         <w:spacing w:before="160" w:after="80"/>
       </w:pPr>
@@ -10019,6 +10440,59 @@
           <w:sz w:val="24"/>
         </w:rPr>
         <w:t>The database server stores customer records, account information, and transaction data. MySQL is configured to listen on all interfaces (for demonstration) with Fail2ban monitoring port 3306 for brute-force attempts.</w:t>
+      </w:r>
+    </w:p>
+    <w:p>
+      <w:pPr>
+        <w:jc w:val="center"/>
+      </w:pPr>
+      <w:r>
+        <w:drawing>
+          <wp:inline xmlns:a="http://schemas.openxmlformats.org/drawingml/2006/main" xmlns:pic="http://schemas.openxmlformats.org/drawingml/2006/picture">
+            <wp:extent cx="5400000" cy="2771405"/>
+            <wp:docPr id="5" name="Picture 5"/>
+            <wp:cNvGraphicFramePr>
+              <a:graphicFrameLocks noChangeAspect="1"/>
+            </wp:cNvGraphicFramePr>
+            <a:graphic>
+              <a:graphicData uri="http://schemas.openxmlformats.org/drawingml/2006/picture">
+                <pic:pic>
+                  <pic:nvPicPr>
+                    <pic:cNvPr id="0" name="pasted_file_LAOEvP_image.png"/>
+                    <pic:cNvPicPr/>
+                  </pic:nvPicPr>
+                  <pic:blipFill>
+                    <a:blip r:embed="rId12"/>
+                    <a:stretch>
+                      <a:fillRect/>
+                    </a:stretch>
+                  </pic:blipFill>
+                  <pic:spPr>
+                    <a:xfrm>
+                      <a:off x="0" y="0"/>
+                      <a:ext cx="5400000" cy="2771405"/>
+                    </a:xfrm>
+                    <a:prstGeom prst="rect"/>
+                  </pic:spPr>
+                </pic:pic>
+              </a:graphicData>
+            </a:graphic>
+          </wp:inline>
+        </w:drawing>
+      </w:r>
+    </w:p>
+    <w:p>
+      <w:pPr>
+        <w:spacing w:after="160"/>
+        <w:jc w:val="center"/>
+      </w:pPr>
+      <w:r>
+        <w:rPr>
+          <w:rFonts w:ascii="Times New Roman" w:hAnsi="Times New Roman"/>
+          <w:i/>
+          <w:sz w:val="20"/>
+        </w:rPr>
+        <w:t>Figure 4.3.3: MySQL Database Tables</w:t>
       </w:r>
     </w:p>
     <w:p>
@@ -18041,6 +18515,469 @@
           <w:sz w:val="22"/>
         </w:rPr>
         <w:t>Automated penetration testing reports: Generate PTES-format reports from attack simulation results.</w:t>
+      </w:r>
+    </w:p>
+    <w:p>
+      <w:pPr>
+        <w:pStyle w:val="Heading2"/>
+        <w:spacing w:before="240" w:after="120"/>
+      </w:pPr>
+      <w:r>
+        <w:t>6.3  Ethical Considerations and Data Privacy</w:t>
+      </w:r>
+    </w:p>
+    <w:p>
+      <w:pPr>
+        <w:spacing w:after="120" w:line="360" w:lineRule="exact"/>
+        <w:ind w:firstLine="709"/>
+      </w:pPr>
+      <w:r>
+        <w:rPr>
+          <w:rFonts w:ascii="Times New Roman" w:hAnsi="Times New Roman"/>
+          <w:sz w:val="24"/>
+        </w:rPr>
+        <w:t>As a security monitoring system, AEGIS handles sensitive network data and log information. Ethical considerations were paramount during its development:</w:t>
+      </w:r>
+    </w:p>
+    <w:p>
+      <w:pPr>
+        <w:pStyle w:val="ListBullet"/>
+        <w:spacing w:after="60"/>
+        <w:ind w:left="709"/>
+      </w:pPr>
+      <w:r>
+        <w:rPr>
+          <w:rFonts w:ascii="Times New Roman" w:hAnsi="Times New Roman"/>
+          <w:sz w:val="22"/>
+        </w:rPr>
+        <w:t>Data Minimization: The system only collects security-relevant log data (auth failures, IDS alerts, firewall events) and does not inspect private user content.</w:t>
+      </w:r>
+    </w:p>
+    <w:p>
+      <w:pPr>
+        <w:pStyle w:val="ListBullet"/>
+        <w:spacing w:after="60"/>
+        <w:ind w:left="709"/>
+      </w:pPr>
+      <w:r>
+        <w:rPr>
+          <w:rFonts w:ascii="Times New Roman" w:hAnsi="Times New Roman"/>
+          <w:sz w:val="22"/>
+        </w:rPr>
+        <w:t>Secure Storage: All security events are stored in an encrypted PostgreSQL database on Supabase, with access restricted via JWT and API keys.</w:t>
+      </w:r>
+    </w:p>
+    <w:p>
+      <w:pPr>
+        <w:pStyle w:val="ListBullet"/>
+        <w:spacing w:after="60"/>
+        <w:ind w:left="709"/>
+      </w:pPr>
+      <w:r>
+        <w:rPr>
+          <w:rFonts w:ascii="Times New Roman" w:hAnsi="Times New Roman"/>
+          <w:sz w:val="22"/>
+        </w:rPr>
+        <w:t>Ethical Testing: All attack simulations were conducted in a strictly isolated GNS3 virtual environment. No external networks or unauthorized systems were targeted.</w:t>
+      </w:r>
+    </w:p>
+    <w:p>
+      <w:pPr>
+        <w:pStyle w:val="ListBullet"/>
+        <w:spacing w:after="60"/>
+        <w:ind w:left="709"/>
+      </w:pPr>
+      <w:r>
+        <w:rPr>
+          <w:rFonts w:ascii="Times New Roman" w:hAnsi="Times New Roman"/>
+          <w:sz w:val="22"/>
+        </w:rPr>
+        <w:t>Compliance: The system design follows principles of the General Data Protection Regulation (GDPR) regarding log retention and data access auditing.</w:t>
+      </w:r>
+    </w:p>
+    <w:tbl>
+      <w:tblPr>
+        <w:tblStyle w:val="TableGrid"/>
+        <w:tblW w:type="auto" w:w="0"/>
+        <w:jc w:val="center"/>
+        <w:tblLook w:firstColumn="1" w:firstRow="1" w:lastColumn="0" w:lastRow="0" w:noHBand="0" w:noVBand="1" w:val="04A0"/>
+      </w:tblPr>
+      <w:tblGrid>
+        <w:gridCol w:w="2197"/>
+        <w:gridCol w:w="2197"/>
+        <w:gridCol w:w="2197"/>
+        <w:gridCol w:w="2197"/>
+      </w:tblGrid>
+      <w:tr>
+        <w:tc>
+          <w:tcPr>
+            <w:tcW w:type="dxa" w:w="1701"/>
+            <w:shd w:val="clear" w:color="auto" w:fill="003366"/>
+          </w:tcPr>
+          <w:p>
+            <w:pPr>
+              <w:jc w:val="center"/>
+            </w:pPr>
+            <w:r>
+              <w:rPr>
+                <w:rFonts w:ascii="Times New Roman" w:hAnsi="Times New Roman"/>
+                <w:b/>
+                <w:color w:val="FFFFFF"/>
+                <w:sz w:val="20"/>
+              </w:rPr>
+              <w:t>Data Type</w:t>
+            </w:r>
+          </w:p>
+        </w:tc>
+        <w:tc>
+          <w:tcPr>
+            <w:tcW w:type="dxa" w:w="2268"/>
+            <w:shd w:val="clear" w:color="auto" w:fill="003366"/>
+          </w:tcPr>
+          <w:p>
+            <w:pPr>
+              <w:jc w:val="center"/>
+            </w:pPr>
+            <w:r>
+              <w:rPr>
+                <w:rFonts w:ascii="Times New Roman" w:hAnsi="Times New Roman"/>
+                <w:b/>
+                <w:color w:val="FFFFFF"/>
+                <w:sz w:val="20"/>
+              </w:rPr>
+              <w:t>Retention Period</w:t>
+            </w:r>
+          </w:p>
+        </w:tc>
+        <w:tc>
+          <w:tcPr>
+            <w:tcW w:type="dxa" w:w="2835"/>
+            <w:shd w:val="clear" w:color="auto" w:fill="003366"/>
+          </w:tcPr>
+          <w:p>
+            <w:pPr>
+              <w:jc w:val="center"/>
+            </w:pPr>
+            <w:r>
+              <w:rPr>
+                <w:rFonts w:ascii="Times New Roman" w:hAnsi="Times New Roman"/>
+                <w:b/>
+                <w:color w:val="FFFFFF"/>
+                <w:sz w:val="20"/>
+              </w:rPr>
+              <w:t>Purpose</w:t>
+            </w:r>
+          </w:p>
+        </w:tc>
+        <w:tc>
+          <w:tcPr>
+            <w:tcW w:type="dxa" w:w="2268"/>
+            <w:shd w:val="clear" w:color="auto" w:fill="003366"/>
+          </w:tcPr>
+          <w:p>
+            <w:pPr>
+              <w:jc w:val="center"/>
+            </w:pPr>
+            <w:r>
+              <w:rPr>
+                <w:rFonts w:ascii="Times New Roman" w:hAnsi="Times New Roman"/>
+                <w:b/>
+                <w:color w:val="FFFFFF"/>
+                <w:sz w:val="20"/>
+              </w:rPr>
+              <w:t>Access Level</w:t>
+            </w:r>
+          </w:p>
+        </w:tc>
+      </w:tr>
+      <w:tr>
+        <w:tc>
+          <w:tcPr>
+            <w:tcW w:type="dxa" w:w="1701"/>
+          </w:tcPr>
+          <w:p>
+            <w:pPr>
+              <w:jc w:val="left"/>
+            </w:pPr>
+            <w:r>
+              <w:rPr>
+                <w:rFonts w:ascii="Times New Roman" w:hAnsi="Times New Roman"/>
+                <w:sz w:val="20"/>
+              </w:rPr>
+              <w:t>Security Events</w:t>
+            </w:r>
+          </w:p>
+        </w:tc>
+        <w:tc>
+          <w:tcPr>
+            <w:tcW w:type="dxa" w:w="2268"/>
+          </w:tcPr>
+          <w:p>
+            <w:pPr>
+              <w:jc w:val="left"/>
+            </w:pPr>
+            <w:r>
+              <w:rPr>
+                <w:rFonts w:ascii="Times New Roman" w:hAnsi="Times New Roman"/>
+                <w:sz w:val="20"/>
+              </w:rPr>
+              <w:t>90 Days</w:t>
+            </w:r>
+          </w:p>
+        </w:tc>
+        <w:tc>
+          <w:tcPr>
+            <w:tcW w:type="dxa" w:w="2835"/>
+          </w:tcPr>
+          <w:p>
+            <w:pPr>
+              <w:jc w:val="left"/>
+            </w:pPr>
+            <w:r>
+              <w:rPr>
+                <w:rFonts w:ascii="Times New Roman" w:hAnsi="Times New Roman"/>
+                <w:sz w:val="20"/>
+              </w:rPr>
+              <w:t>Threat analysis and auditing</w:t>
+            </w:r>
+          </w:p>
+        </w:tc>
+        <w:tc>
+          <w:tcPr>
+            <w:tcW w:type="dxa" w:w="2268"/>
+          </w:tcPr>
+          <w:p>
+            <w:pPr>
+              <w:jc w:val="left"/>
+            </w:pPr>
+            <w:r>
+              <w:rPr>
+                <w:rFonts w:ascii="Times New Roman" w:hAnsi="Times New Roman"/>
+                <w:sz w:val="20"/>
+              </w:rPr>
+              <w:t>Admin Only</w:t>
+            </w:r>
+          </w:p>
+        </w:tc>
+      </w:tr>
+      <w:tr>
+        <w:tc>
+          <w:tcPr>
+            <w:tcW w:type="dxa" w:w="1701"/>
+          </w:tcPr>
+          <w:p>
+            <w:pPr>
+              <w:jc w:val="left"/>
+            </w:pPr>
+            <w:r>
+              <w:rPr>
+                <w:rFonts w:ascii="Times New Roman" w:hAnsi="Times New Roman"/>
+                <w:sz w:val="20"/>
+              </w:rPr>
+              <w:t>System Health</w:t>
+            </w:r>
+          </w:p>
+        </w:tc>
+        <w:tc>
+          <w:tcPr>
+            <w:tcW w:type="dxa" w:w="2268"/>
+          </w:tcPr>
+          <w:p>
+            <w:pPr>
+              <w:jc w:val="left"/>
+            </w:pPr>
+            <w:r>
+              <w:rPr>
+                <w:rFonts w:ascii="Times New Roman" w:hAnsi="Times New Roman"/>
+                <w:sz w:val="20"/>
+              </w:rPr>
+              <w:t>30 Days</w:t>
+            </w:r>
+          </w:p>
+        </w:tc>
+        <w:tc>
+          <w:tcPr>
+            <w:tcW w:type="dxa" w:w="2835"/>
+          </w:tcPr>
+          <w:p>
+            <w:pPr>
+              <w:jc w:val="left"/>
+            </w:pPr>
+            <w:r>
+              <w:rPr>
+                <w:rFonts w:ascii="Times New Roman" w:hAnsi="Times New Roman"/>
+                <w:sz w:val="20"/>
+              </w:rPr>
+              <w:t>Performance monitoring</w:t>
+            </w:r>
+          </w:p>
+        </w:tc>
+        <w:tc>
+          <w:tcPr>
+            <w:tcW w:type="dxa" w:w="2268"/>
+          </w:tcPr>
+          <w:p>
+            <w:pPr>
+              <w:jc w:val="left"/>
+            </w:pPr>
+            <w:r>
+              <w:rPr>
+                <w:rFonts w:ascii="Times New Roman" w:hAnsi="Times New Roman"/>
+                <w:sz w:val="20"/>
+              </w:rPr>
+              <w:t>Admin Only</w:t>
+            </w:r>
+          </w:p>
+        </w:tc>
+      </w:tr>
+      <w:tr>
+        <w:tc>
+          <w:tcPr>
+            <w:tcW w:type="dxa" w:w="1701"/>
+          </w:tcPr>
+          <w:p>
+            <w:pPr>
+              <w:jc w:val="left"/>
+            </w:pPr>
+            <w:r>
+              <w:rPr>
+                <w:rFonts w:ascii="Times New Roman" w:hAnsi="Times New Roman"/>
+                <w:sz w:val="20"/>
+              </w:rPr>
+              <w:t>Audit Logs</w:t>
+            </w:r>
+          </w:p>
+        </w:tc>
+        <w:tc>
+          <w:tcPr>
+            <w:tcW w:type="dxa" w:w="2268"/>
+          </w:tcPr>
+          <w:p>
+            <w:pPr>
+              <w:jc w:val="left"/>
+            </w:pPr>
+            <w:r>
+              <w:rPr>
+                <w:rFonts w:ascii="Times New Roman" w:hAnsi="Times New Roman"/>
+                <w:sz w:val="20"/>
+              </w:rPr>
+              <w:t>1 Year</w:t>
+            </w:r>
+          </w:p>
+        </w:tc>
+        <w:tc>
+          <w:tcPr>
+            <w:tcW w:type="dxa" w:w="2835"/>
+          </w:tcPr>
+          <w:p>
+            <w:pPr>
+              <w:jc w:val="left"/>
+            </w:pPr>
+            <w:r>
+              <w:rPr>
+                <w:rFonts w:ascii="Times New Roman" w:hAnsi="Times New Roman"/>
+                <w:sz w:val="20"/>
+              </w:rPr>
+              <w:t>Compliance and accountability</w:t>
+            </w:r>
+          </w:p>
+        </w:tc>
+        <w:tc>
+          <w:tcPr>
+            <w:tcW w:type="dxa" w:w="2268"/>
+          </w:tcPr>
+          <w:p>
+            <w:pPr>
+              <w:jc w:val="left"/>
+            </w:pPr>
+            <w:r>
+              <w:rPr>
+                <w:rFonts w:ascii="Times New Roman" w:hAnsi="Times New Roman"/>
+                <w:sz w:val="20"/>
+              </w:rPr>
+              <w:t>Super Admin</w:t>
+            </w:r>
+          </w:p>
+        </w:tc>
+      </w:tr>
+    </w:tbl>
+    <w:p/>
+    <w:p>
+      <w:pPr>
+        <w:pStyle w:val="Heading2"/>
+        <w:spacing w:before="240" w:after="120"/>
+      </w:pPr>
+      <w:r>
+        <w:t>6.4  Scalability and Maintenance</w:t>
+      </w:r>
+    </w:p>
+    <w:p>
+      <w:pPr>
+        <w:spacing w:after="120" w:line="360" w:lineRule="exact"/>
+        <w:ind w:firstLine="709"/>
+      </w:pPr>
+      <w:r>
+        <w:rPr>
+          <w:rFonts w:ascii="Times New Roman" w:hAnsi="Times New Roman"/>
+          <w:sz w:val="24"/>
+        </w:rPr>
+        <w:t>AEGIS is designed with scalability in mind to accommodate growing network environments:</w:t>
+      </w:r>
+    </w:p>
+    <w:p>
+      <w:pPr>
+        <w:pStyle w:val="ListBullet"/>
+        <w:spacing w:after="60"/>
+        <w:ind w:left="709"/>
+      </w:pPr>
+      <w:r>
+        <w:rPr>
+          <w:rFonts w:ascii="Times New Roman" w:hAnsi="Times New Roman"/>
+          <w:sz w:val="22"/>
+        </w:rPr>
+        <w:t>Horizontal Scaling: The Express.js API server can be deployed across multiple containers using a load balancer to handle increased event volume.</w:t>
+      </w:r>
+    </w:p>
+    <w:p>
+      <w:pPr>
+        <w:pStyle w:val="ListBullet"/>
+        <w:spacing w:after="60"/>
+        <w:ind w:left="709"/>
+      </w:pPr>
+      <w:r>
+        <w:rPr>
+          <w:rFonts w:ascii="Times New Roman" w:hAnsi="Times New Roman"/>
+          <w:sz w:val="22"/>
+        </w:rPr>
+        <w:t>Database Pooling: Drizzle ORM and Supabase connection pooling ensure efficient database performance under high concurrency.</w:t>
+      </w:r>
+    </w:p>
+    <w:p>
+      <w:pPr>
+        <w:pStyle w:val="ListBullet"/>
+        <w:spacing w:after="60"/>
+        <w:ind w:left="709"/>
+      </w:pPr>
+      <w:r>
+        <w:rPr>
+          <w:rFonts w:ascii="Times New Roman" w:hAnsi="Times New Roman"/>
+          <w:sz w:val="22"/>
+        </w:rPr>
+        <w:t>Modular Agents: The Python forwarder agent uses a multi-threaded hub-and-spoke model, allowing it to monitor dozens of VMs from a single management node.</w:t>
+      </w:r>
+    </w:p>
+    <w:p>
+      <w:pPr>
+        <w:pStyle w:val="ListBullet"/>
+        <w:spacing w:after="60"/>
+        <w:ind w:left="709"/>
+      </w:pPr>
+      <w:r>
+        <w:rPr>
+          <w:rFonts w:ascii="Times New Roman" w:hAnsi="Times New Roman"/>
+          <w:sz w:val="22"/>
+        </w:rPr>
+        <w:t>Cloud-Native Architecture: By leveraging Vercel and Render, the system benefits from automatic scaling and high availability provided by modern PaaS providers.</w:t>
       </w:r>
     </w:p>
     <w:p>

</xml_diff>

<commit_message>
Update project book with all figure placeholders
</commit_message>
<xml_diff>
--- a/AEGIS_SOC_Dashboard_Project_Book.docx
+++ b/AEGIS_SOC_Dashboard_Project_Book.docx
@@ -6336,6 +6336,59 @@
           <w:sz w:val="24"/>
         </w:rPr>
         <w:t>AEGIS follows a three-tier architecture separating data collection, processing, and presentation layers:</w:t>
+      </w:r>
+    </w:p>
+    <w:p>
+      <w:pPr>
+        <w:jc w:val="center"/>
+      </w:pPr>
+      <w:r>
+        <w:drawing>
+          <wp:inline xmlns:a="http://schemas.openxmlformats.org/drawingml/2006/main" xmlns:pic="http://schemas.openxmlformats.org/drawingml/2006/picture">
+            <wp:extent cx="5400000" cy="2700000"/>
+            <wp:docPr id="1" name="Picture 1"/>
+            <wp:cNvGraphicFramePr>
+              <a:graphicFrameLocks noChangeAspect="1"/>
+            </wp:cNvGraphicFramePr>
+            <a:graphic>
+              <a:graphicData uri="http://schemas.openxmlformats.org/drawingml/2006/picture">
+                <pic:pic>
+                  <pic:nvPicPr>
+                    <pic:cNvPr id="0" name="placeholder.png"/>
+                    <pic:cNvPicPr/>
+                  </pic:nvPicPr>
+                  <pic:blipFill>
+                    <a:blip r:embed="rId9"/>
+                    <a:stretch>
+                      <a:fillRect/>
+                    </a:stretch>
+                  </pic:blipFill>
+                  <pic:spPr>
+                    <a:xfrm>
+                      <a:off x="0" y="0"/>
+                      <a:ext cx="5400000" cy="2700000"/>
+                    </a:xfrm>
+                    <a:prstGeom prst="rect"/>
+                  </pic:spPr>
+                </pic:pic>
+              </a:graphicData>
+            </a:graphic>
+          </wp:inline>
+        </w:drawing>
+      </w:r>
+    </w:p>
+    <w:p>
+      <w:pPr>
+        <w:spacing w:after="160"/>
+        <w:jc w:val="center"/>
+      </w:pPr>
+      <w:r>
+        <w:rPr>
+          <w:rFonts w:ascii="Times New Roman" w:hAnsi="Times New Roman"/>
+          <w:i/>
+          <w:sz w:val="20"/>
+        </w:rPr>
+        <w:t>Figure 3.1: Overall AEGIS System Architecture</w:t>
       </w:r>
     </w:p>
     <w:p>
@@ -7105,7 +7158,7 @@
         <w:drawing>
           <wp:inline xmlns:a="http://schemas.openxmlformats.org/drawingml/2006/main" xmlns:pic="http://schemas.openxmlformats.org/drawingml/2006/picture">
             <wp:extent cx="5400000" cy="2934423"/>
-            <wp:docPr id="1" name="Picture 1"/>
+            <wp:docPr id="2" name="Picture 2"/>
             <wp:cNvGraphicFramePr>
               <a:graphicFrameLocks noChangeAspect="1"/>
             </wp:cNvGraphicFramePr>
@@ -7117,7 +7170,7 @@
                     <pic:cNvPicPr/>
                   </pic:nvPicPr>
                   <pic:blipFill>
-                    <a:blip r:embed="rId9"/>
+                    <a:blip r:embed="rId10"/>
                     <a:stretch>
                       <a:fillRect/>
                     </a:stretch>
@@ -7172,6 +7225,59 @@
         <w:t>The AEGIS database is hosted on Supabase (managed PostgreSQL). The core tables are:</w:t>
       </w:r>
     </w:p>
+    <w:p>
+      <w:pPr>
+        <w:jc w:val="center"/>
+      </w:pPr>
+      <w:r>
+        <w:drawing>
+          <wp:inline xmlns:a="http://schemas.openxmlformats.org/drawingml/2006/main" xmlns:pic="http://schemas.openxmlformats.org/drawingml/2006/picture">
+            <wp:extent cx="5400000" cy="2700000"/>
+            <wp:docPr id="3" name="Picture 3"/>
+            <wp:cNvGraphicFramePr>
+              <a:graphicFrameLocks noChangeAspect="1"/>
+            </wp:cNvGraphicFramePr>
+            <a:graphic>
+              <a:graphicData uri="http://schemas.openxmlformats.org/drawingml/2006/picture">
+                <pic:pic>
+                  <pic:nvPicPr>
+                    <pic:cNvPr id="0" name="placeholder.png"/>
+                    <pic:cNvPicPr/>
+                  </pic:nvPicPr>
+                  <pic:blipFill>
+                    <a:blip r:embed="rId9"/>
+                    <a:stretch>
+                      <a:fillRect/>
+                    </a:stretch>
+                  </pic:blipFill>
+                  <pic:spPr>
+                    <a:xfrm>
+                      <a:off x="0" y="0"/>
+                      <a:ext cx="5400000" cy="2700000"/>
+                    </a:xfrm>
+                    <a:prstGeom prst="rect"/>
+                  </pic:spPr>
+                </pic:pic>
+              </a:graphicData>
+            </a:graphic>
+          </wp:inline>
+        </w:drawing>
+      </w:r>
+    </w:p>
+    <w:p>
+      <w:pPr>
+        <w:spacing w:after="160"/>
+        <w:jc w:val="center"/>
+      </w:pPr>
+      <w:r>
+        <w:rPr>
+          <w:rFonts w:ascii="Times New Roman" w:hAnsi="Times New Roman"/>
+          <w:i/>
+          <w:sz w:val="20"/>
+        </w:rPr>
+        <w:t>Figure 3.3: Database Entity-Relationship Diagram</w:t>
+      </w:r>
+    </w:p>
     <w:tbl>
       <w:tblPr>
         <w:tblStyle w:val="TableGrid"/>
@@ -7787,6 +7893,59 @@
           <w:sz w:val="22"/>
         </w:rPr>
         <w:t>Public endpoints (/api/events, /api/alerts, /api/hosts, /api/ai/*, /api/stream): JWT-protected. Used by the dashboard for data display.</w:t>
+      </w:r>
+    </w:p>
+    <w:p>
+      <w:pPr>
+        <w:jc w:val="center"/>
+      </w:pPr>
+      <w:r>
+        <w:drawing>
+          <wp:inline xmlns:a="http://schemas.openxmlformats.org/drawingml/2006/main" xmlns:pic="http://schemas.openxmlformats.org/drawingml/2006/picture">
+            <wp:extent cx="5400000" cy="2700000"/>
+            <wp:docPr id="4" name="Picture 4"/>
+            <wp:cNvGraphicFramePr>
+              <a:graphicFrameLocks noChangeAspect="1"/>
+            </wp:cNvGraphicFramePr>
+            <a:graphic>
+              <a:graphicData uri="http://schemas.openxmlformats.org/drawingml/2006/picture">
+                <pic:pic>
+                  <pic:nvPicPr>
+                    <pic:cNvPr id="0" name="placeholder.png"/>
+                    <pic:cNvPicPr/>
+                  </pic:nvPicPr>
+                  <pic:blipFill>
+                    <a:blip r:embed="rId9"/>
+                    <a:stretch>
+                      <a:fillRect/>
+                    </a:stretch>
+                  </pic:blipFill>
+                  <pic:spPr>
+                    <a:xfrm>
+                      <a:off x="0" y="0"/>
+                      <a:ext cx="5400000" cy="2700000"/>
+                    </a:xfrm>
+                    <a:prstGeom prst="rect"/>
+                  </pic:spPr>
+                </pic:pic>
+              </a:graphicData>
+            </a:graphic>
+          </wp:inline>
+        </w:drawing>
+      </w:r>
+    </w:p>
+    <w:p>
+      <w:pPr>
+        <w:spacing w:after="160"/>
+        <w:jc w:val="center"/>
+      </w:pPr>
+      <w:r>
+        <w:rPr>
+          <w:rFonts w:ascii="Times New Roman" w:hAnsi="Times New Roman"/>
+          <w:i/>
+          <w:sz w:val="20"/>
+        </w:rPr>
+        <w:t>Figure 3.4: API Server Request-Response Flow</w:t>
       </w:r>
     </w:p>
     <w:p>
@@ -9234,7 +9393,7 @@
         <w:drawing>
           <wp:inline xmlns:a="http://schemas.openxmlformats.org/drawingml/2006/main" xmlns:pic="http://schemas.openxmlformats.org/drawingml/2006/picture">
             <wp:extent cx="5400000" cy="2934423"/>
-            <wp:docPr id="2" name="Picture 2"/>
+            <wp:docPr id="5" name="Picture 5"/>
             <wp:cNvGraphicFramePr>
               <a:graphicFrameLocks noChangeAspect="1"/>
             </wp:cNvGraphicFramePr>
@@ -9246,7 +9405,7 @@
                     <pic:cNvPicPr/>
                   </pic:nvPicPr>
                   <pic:blipFill>
-                    <a:blip r:embed="rId9"/>
+                    <a:blip r:embed="rId10"/>
                     <a:stretch>
                       <a:fillRect/>
                     </a:stretch>
@@ -10150,6 +10309,59 @@
     </w:p>
     <w:p>
       <w:pPr>
+        <w:jc w:val="center"/>
+      </w:pPr>
+      <w:r>
+        <w:drawing>
+          <wp:inline xmlns:a="http://schemas.openxmlformats.org/drawingml/2006/main" xmlns:pic="http://schemas.openxmlformats.org/drawingml/2006/picture">
+            <wp:extent cx="5400000" cy="2700000"/>
+            <wp:docPr id="6" name="Picture 6"/>
+            <wp:cNvGraphicFramePr>
+              <a:graphicFrameLocks noChangeAspect="1"/>
+            </wp:cNvGraphicFramePr>
+            <a:graphic>
+              <a:graphicData uri="http://schemas.openxmlformats.org/drawingml/2006/picture">
+                <pic:pic>
+                  <pic:nvPicPr>
+                    <pic:cNvPr id="0" name="placeholder.png"/>
+                    <pic:cNvPicPr/>
+                  </pic:nvPicPr>
+                  <pic:blipFill>
+                    <a:blip r:embed="rId9"/>
+                    <a:stretch>
+                      <a:fillRect/>
+                    </a:stretch>
+                  </pic:blipFill>
+                  <pic:spPr>
+                    <a:xfrm>
+                      <a:off x="0" y="0"/>
+                      <a:ext cx="5400000" cy="2700000"/>
+                    </a:xfrm>
+                    <a:prstGeom prst="rect"/>
+                  </pic:spPr>
+                </pic:pic>
+              </a:graphicData>
+            </a:graphic>
+          </wp:inline>
+        </w:drawing>
+      </w:r>
+    </w:p>
+    <w:p>
+      <w:pPr>
+        <w:spacing w:after="160"/>
+        <w:jc w:val="center"/>
+      </w:pPr>
+      <w:r>
+        <w:rPr>
+          <w:rFonts w:ascii="Times New Roman" w:hAnsi="Times New Roman"/>
+          <w:i/>
+          <w:sz w:val="20"/>
+        </w:rPr>
+        <w:t>Figure 4.2: pfSense Interface Configuration Screenshot</w:t>
+      </w:r>
+    </w:p>
+    <w:p>
+      <w:pPr>
         <w:pStyle w:val="Heading2"/>
         <w:spacing w:before="240" w:after="120"/>
       </w:pPr>
@@ -10269,7 +10481,7 @@
         <w:drawing>
           <wp:inline xmlns:a="http://schemas.openxmlformats.org/drawingml/2006/main" xmlns:pic="http://schemas.openxmlformats.org/drawingml/2006/picture">
             <wp:extent cx="5400000" cy="2982688"/>
-            <wp:docPr id="3" name="Picture 3"/>
+            <wp:docPr id="7" name="Picture 7"/>
             <wp:cNvGraphicFramePr>
               <a:graphicFrameLocks noChangeAspect="1"/>
             </wp:cNvGraphicFramePr>
@@ -10281,7 +10493,7 @@
                     <pic:cNvPicPr/>
                   </pic:nvPicPr>
                   <pic:blipFill>
-                    <a:blip r:embed="rId10"/>
+                    <a:blip r:embed="rId11"/>
                     <a:stretch>
                       <a:fillRect/>
                     </a:stretch>
@@ -10375,7 +10587,7 @@
         <w:drawing>
           <wp:inline xmlns:a="http://schemas.openxmlformats.org/drawingml/2006/main" xmlns:pic="http://schemas.openxmlformats.org/drawingml/2006/picture">
             <wp:extent cx="5400000" cy="2980567"/>
-            <wp:docPr id="4" name="Picture 4"/>
+            <wp:docPr id="8" name="Picture 8"/>
             <wp:cNvGraphicFramePr>
               <a:graphicFrameLocks noChangeAspect="1"/>
             </wp:cNvGraphicFramePr>
@@ -10387,7 +10599,7 @@
                     <pic:cNvPicPr/>
                   </pic:nvPicPr>
                   <pic:blipFill>
-                    <a:blip r:embed="rId11"/>
+                    <a:blip r:embed="rId12"/>
                     <a:stretch>
                       <a:fillRect/>
                     </a:stretch>
@@ -10450,7 +10662,7 @@
         <w:drawing>
           <wp:inline xmlns:a="http://schemas.openxmlformats.org/drawingml/2006/main" xmlns:pic="http://schemas.openxmlformats.org/drawingml/2006/picture">
             <wp:extent cx="5400000" cy="2771405"/>
-            <wp:docPr id="5" name="Picture 5"/>
+            <wp:docPr id="9" name="Picture 9"/>
             <wp:cNvGraphicFramePr>
               <a:graphicFrameLocks noChangeAspect="1"/>
             </wp:cNvGraphicFramePr>
@@ -10462,7 +10674,7 @@
                     <pic:cNvPicPr/>
                   </pic:nvPicPr>
                   <pic:blipFill>
-                    <a:blip r:embed="rId12"/>
+                    <a:blip r:embed="rId13"/>
                     <a:stretch>
                       <a:fillRect/>
                     </a:stretch>
@@ -10515,6 +10727,59 @@
           <w:sz w:val="24"/>
         </w:rPr>
         <w:t>OpenLDAP provides centralized authentication for company staff. The web application on company-web-server authenticates staff login credentials against LDAP. Fail2ban monitors LDAP authentication failures.</w:t>
+      </w:r>
+    </w:p>
+    <w:p>
+      <w:pPr>
+        <w:jc w:val="center"/>
+      </w:pPr>
+      <w:r>
+        <w:drawing>
+          <wp:inline xmlns:a="http://schemas.openxmlformats.org/drawingml/2006/main" xmlns:pic="http://schemas.openxmlformats.org/drawingml/2006/picture">
+            <wp:extent cx="5400000" cy="2700000"/>
+            <wp:docPr id="10" name="Picture 10"/>
+            <wp:cNvGraphicFramePr>
+              <a:graphicFrameLocks noChangeAspect="1"/>
+            </wp:cNvGraphicFramePr>
+            <a:graphic>
+              <a:graphicData uri="http://schemas.openxmlformats.org/drawingml/2006/picture">
+                <pic:pic>
+                  <pic:nvPicPr>
+                    <pic:cNvPr id="0" name="placeholder.png"/>
+                    <pic:cNvPicPr/>
+                  </pic:nvPicPr>
+                  <pic:blipFill>
+                    <a:blip r:embed="rId9"/>
+                    <a:stretch>
+                      <a:fillRect/>
+                    </a:stretch>
+                  </pic:blipFill>
+                  <pic:spPr>
+                    <a:xfrm>
+                      <a:off x="0" y="0"/>
+                      <a:ext cx="5400000" cy="2700000"/>
+                    </a:xfrm>
+                    <a:prstGeom prst="rect"/>
+                  </pic:spPr>
+                </pic:pic>
+              </a:graphicData>
+            </a:graphic>
+          </wp:inline>
+        </w:drawing>
+      </w:r>
+    </w:p>
+    <w:p>
+      <w:pPr>
+        <w:spacing w:after="160"/>
+        <w:jc w:val="center"/>
+      </w:pPr>
+      <w:r>
+        <w:rPr>
+          <w:rFonts w:ascii="Times New Roman" w:hAnsi="Times New Roman"/>
+          <w:i/>
+          <w:sz w:val="20"/>
+        </w:rPr>
+        <w:t>Figure 4.3.4: OpenLDAP Directory Structure</w:t>
       </w:r>
     </w:p>
     <w:p>
@@ -11609,6 +11874,59 @@
     </w:p>
     <w:p>
       <w:pPr>
+        <w:jc w:val="center"/>
+      </w:pPr>
+      <w:r>
+        <w:drawing>
+          <wp:inline xmlns:a="http://schemas.openxmlformats.org/drawingml/2006/main" xmlns:pic="http://schemas.openxmlformats.org/drawingml/2006/picture">
+            <wp:extent cx="5400000" cy="2700000"/>
+            <wp:docPr id="11" name="Picture 11"/>
+            <wp:cNvGraphicFramePr>
+              <a:graphicFrameLocks noChangeAspect="1"/>
+            </wp:cNvGraphicFramePr>
+            <a:graphic>
+              <a:graphicData uri="http://schemas.openxmlformats.org/drawingml/2006/picture">
+                <pic:pic>
+                  <pic:nvPicPr>
+                    <pic:cNvPr id="0" name="placeholder.png"/>
+                    <pic:cNvPicPr/>
+                  </pic:nvPicPr>
+                  <pic:blipFill>
+                    <a:blip r:embed="rId9"/>
+                    <a:stretch>
+                      <a:fillRect/>
+                    </a:stretch>
+                  </pic:blipFill>
+                  <pic:spPr>
+                    <a:xfrm>
+                      <a:off x="0" y="0"/>
+                      <a:ext cx="5400000" cy="2700000"/>
+                    </a:xfrm>
+                    <a:prstGeom prst="rect"/>
+                  </pic:spPr>
+                </pic:pic>
+              </a:graphicData>
+            </a:graphic>
+          </wp:inline>
+        </w:drawing>
+      </w:r>
+    </w:p>
+    <w:p>
+      <w:pPr>
+        <w:spacing w:after="160"/>
+        <w:jc w:val="center"/>
+      </w:pPr>
+      <w:r>
+        <w:rPr>
+          <w:rFonts w:ascii="Times New Roman" w:hAnsi="Times New Roman"/>
+          <w:i/>
+          <w:sz w:val="20"/>
+        </w:rPr>
+        <w:t>Figure 4.5: Fail2ban Jail Configuration on company-web-server</w:t>
+      </w:r>
+    </w:p>
+    <w:p>
+      <w:pPr>
         <w:spacing w:after="120" w:line="360" w:lineRule="exact"/>
         <w:ind w:firstLine="709"/>
       </w:pPr>
@@ -11688,6 +12006,59 @@
     </w:p>
     <w:p>
       <w:pPr>
+        <w:jc w:val="center"/>
+      </w:pPr>
+      <w:r>
+        <w:drawing>
+          <wp:inline xmlns:a="http://schemas.openxmlformats.org/drawingml/2006/main" xmlns:pic="http://schemas.openxmlformats.org/drawingml/2006/picture">
+            <wp:extent cx="5400000" cy="2700000"/>
+            <wp:docPr id="12" name="Picture 12"/>
+            <wp:cNvGraphicFramePr>
+              <a:graphicFrameLocks noChangeAspect="1"/>
+            </wp:cNvGraphicFramePr>
+            <a:graphic>
+              <a:graphicData uri="http://schemas.openxmlformats.org/drawingml/2006/picture">
+                <pic:pic>
+                  <pic:nvPicPr>
+                    <pic:cNvPr id="0" name="placeholder.png"/>
+                    <pic:cNvPicPr/>
+                  </pic:nvPicPr>
+                  <pic:blipFill>
+                    <a:blip r:embed="rId9"/>
+                    <a:stretch>
+                      <a:fillRect/>
+                    </a:stretch>
+                  </pic:blipFill>
+                  <pic:spPr>
+                    <a:xfrm>
+                      <a:off x="0" y="0"/>
+                      <a:ext cx="5400000" cy="2700000"/>
+                    </a:xfrm>
+                    <a:prstGeom prst="rect"/>
+                  </pic:spPr>
+                </pic:pic>
+              </a:graphicData>
+            </a:graphic>
+          </wp:inline>
+        </w:drawing>
+      </w:r>
+    </w:p>
+    <w:p>
+      <w:pPr>
+        <w:spacing w:after="160"/>
+        <w:jc w:val="center"/>
+      </w:pPr>
+      <w:r>
+        <w:rPr>
+          <w:rFonts w:ascii="Times New Roman" w:hAnsi="Times New Roman"/>
+          <w:i/>
+          <w:sz w:val="20"/>
+        </w:rPr>
+        <w:t>Figure 4.6: Suricata IDS EVE JSON Output Sample</w:t>
+      </w:r>
+    </w:p>
+    <w:p>
+      <w:pPr>
         <w:pStyle w:val="Heading2"/>
         <w:spacing w:before="240" w:after="120"/>
       </w:pPr>
@@ -11854,6 +12225,59 @@
           <w:sz w:val="22"/>
         </w:rPr>
         <w:t>ssh_keepalive_loop(hostIp) — 60s keepalive for each SSH connection</w:t>
+      </w:r>
+    </w:p>
+    <w:p>
+      <w:pPr>
+        <w:jc w:val="center"/>
+      </w:pPr>
+      <w:r>
+        <w:drawing>
+          <wp:inline xmlns:a="http://schemas.openxmlformats.org/drawingml/2006/main" xmlns:pic="http://schemas.openxmlformats.org/drawingml/2006/picture">
+            <wp:extent cx="5400000" cy="2700000"/>
+            <wp:docPr id="13" name="Picture 13"/>
+            <wp:cNvGraphicFramePr>
+              <a:graphicFrameLocks noChangeAspect="1"/>
+            </wp:cNvGraphicFramePr>
+            <a:graphic>
+              <a:graphicData uri="http://schemas.openxmlformats.org/drawingml/2006/picture">
+                <pic:pic>
+                  <pic:nvPicPr>
+                    <pic:cNvPr id="0" name="placeholder.png"/>
+                    <pic:cNvPicPr/>
+                  </pic:nvPicPr>
+                  <pic:blipFill>
+                    <a:blip r:embed="rId9"/>
+                    <a:stretch>
+                      <a:fillRect/>
+                    </a:stretch>
+                  </pic:blipFill>
+                  <pic:spPr>
+                    <a:xfrm>
+                      <a:off x="0" y="0"/>
+                      <a:ext cx="5400000" cy="2700000"/>
+                    </a:xfrm>
+                    <a:prstGeom prst="rect"/>
+                  </pic:spPr>
+                </pic:pic>
+              </a:graphicData>
+            </a:graphic>
+          </wp:inline>
+        </w:drawing>
+      </w:r>
+    </w:p>
+    <w:p>
+      <w:pPr>
+        <w:spacing w:after="160"/>
+        <w:jc w:val="center"/>
+      </w:pPr>
+      <w:r>
+        <w:rPr>
+          <w:rFonts w:ascii="Times New Roman" w:hAnsi="Times New Roman"/>
+          <w:i/>
+          <w:sz w:val="20"/>
+        </w:rPr>
+        <w:t>Figure 4.7: AEGIS Forwarder Agent Thread Architecture</w:t>
       </w:r>
     </w:p>
     <w:p>
@@ -12870,6 +13294,59 @@
           <w:sz w:val="24"/>
         </w:rPr>
         <w:t>The auto-defense engine is the most sophisticated component of AEGIS. It translates detected threats into concrete firewall actions without human intervention.</w:t>
+      </w:r>
+    </w:p>
+    <w:p>
+      <w:pPr>
+        <w:jc w:val="center"/>
+      </w:pPr>
+      <w:r>
+        <w:drawing>
+          <wp:inline xmlns:a="http://schemas.openxmlformats.org/drawingml/2006/main" xmlns:pic="http://schemas.openxmlformats.org/drawingml/2006/picture">
+            <wp:extent cx="5400000" cy="2700000"/>
+            <wp:docPr id="14" name="Picture 14"/>
+            <wp:cNvGraphicFramePr>
+              <a:graphicFrameLocks noChangeAspect="1"/>
+            </wp:cNvGraphicFramePr>
+            <a:graphic>
+              <a:graphicData uri="http://schemas.openxmlformats.org/drawingml/2006/picture">
+                <pic:pic>
+                  <pic:nvPicPr>
+                    <pic:cNvPr id="0" name="placeholder.png"/>
+                    <pic:cNvPicPr/>
+                  </pic:nvPicPr>
+                  <pic:blipFill>
+                    <a:blip r:embed="rId9"/>
+                    <a:stretch>
+                      <a:fillRect/>
+                    </a:stretch>
+                  </pic:blipFill>
+                  <pic:spPr>
+                    <a:xfrm>
+                      <a:off x="0" y="0"/>
+                      <a:ext cx="5400000" cy="2700000"/>
+                    </a:xfrm>
+                    <a:prstGeom prst="rect"/>
+                  </pic:spPr>
+                </pic:pic>
+              </a:graphicData>
+            </a:graphic>
+          </wp:inline>
+        </w:drawing>
+      </w:r>
+    </w:p>
+    <w:p>
+      <w:pPr>
+        <w:spacing w:after="160"/>
+        <w:jc w:val="center"/>
+      </w:pPr>
+      <w:r>
+        <w:rPr>
+          <w:rFonts w:ascii="Times New Roman" w:hAnsi="Times New Roman"/>
+          <w:i/>
+          <w:sz w:val="20"/>
+        </w:rPr>
+        <w:t>Figure 4.8: Auto-Defense Engine Pipeline Diagram</w:t>
       </w:r>
     </w:p>
     <w:p>

</xml_diff>

<commit_message>
Update project book with generated architecture and ERD diagrams
</commit_message>
<xml_diff>
--- a/AEGIS_SOC_Dashboard_Project_Book.docx
+++ b/AEGIS_SOC_Dashboard_Project_Book.docx
@@ -6345,7 +6345,7 @@
       <w:r>
         <w:drawing>
           <wp:inline xmlns:a="http://schemas.openxmlformats.org/drawingml/2006/main" xmlns:pic="http://schemas.openxmlformats.org/drawingml/2006/picture">
-            <wp:extent cx="5400000" cy="2700000"/>
+            <wp:extent cx="5400000" cy="3773077"/>
             <wp:docPr id="1" name="Picture 1"/>
             <wp:cNvGraphicFramePr>
               <a:graphicFrameLocks noChangeAspect="1"/>
@@ -6354,7 +6354,7 @@
               <a:graphicData uri="http://schemas.openxmlformats.org/drawingml/2006/picture">
                 <pic:pic>
                   <pic:nvPicPr>
-                    <pic:cNvPr id="0" name="placeholder.png"/>
+                    <pic:cNvPr id="0" name="architecture.png"/>
                     <pic:cNvPicPr/>
                   </pic:nvPicPr>
                   <pic:blipFill>
@@ -6366,7 +6366,7 @@
                   <pic:spPr>
                     <a:xfrm>
                       <a:off x="0" y="0"/>
-                      <a:ext cx="5400000" cy="2700000"/>
+                      <a:ext cx="5400000" cy="3773077"/>
                     </a:xfrm>
                     <a:prstGeom prst="rect"/>
                   </pic:spPr>
@@ -7232,7 +7232,7 @@
       <w:r>
         <w:drawing>
           <wp:inline xmlns:a="http://schemas.openxmlformats.org/drawingml/2006/main" xmlns:pic="http://schemas.openxmlformats.org/drawingml/2006/picture">
-            <wp:extent cx="5400000" cy="2700000"/>
+            <wp:extent cx="5400000" cy="3350769"/>
             <wp:docPr id="3" name="Picture 3"/>
             <wp:cNvGraphicFramePr>
               <a:graphicFrameLocks noChangeAspect="1"/>
@@ -7241,11 +7241,11 @@
               <a:graphicData uri="http://schemas.openxmlformats.org/drawingml/2006/picture">
                 <pic:pic>
                   <pic:nvPicPr>
-                    <pic:cNvPr id="0" name="placeholder.png"/>
+                    <pic:cNvPr id="0" name="database_erd.png"/>
                     <pic:cNvPicPr/>
                   </pic:nvPicPr>
                   <pic:blipFill>
-                    <a:blip r:embed="rId9"/>
+                    <a:blip r:embed="rId11"/>
                     <a:stretch>
                       <a:fillRect/>
                     </a:stretch>
@@ -7253,7 +7253,7 @@
                   <pic:spPr>
                     <a:xfrm>
                       <a:off x="0" y="0"/>
-                      <a:ext cx="5400000" cy="2700000"/>
+                      <a:ext cx="5400000" cy="3350769"/>
                     </a:xfrm>
                     <a:prstGeom prst="rect"/>
                   </pic:spPr>
@@ -7915,7 +7915,7 @@
                     <pic:cNvPicPr/>
                   </pic:nvPicPr>
                   <pic:blipFill>
-                    <a:blip r:embed="rId9"/>
+                    <a:blip r:embed="rId12"/>
                     <a:stretch>
                       <a:fillRect/>
                     </a:stretch>
@@ -10327,7 +10327,7 @@
                     <pic:cNvPicPr/>
                   </pic:nvPicPr>
                   <pic:blipFill>
-                    <a:blip r:embed="rId9"/>
+                    <a:blip r:embed="rId12"/>
                     <a:stretch>
                       <a:fillRect/>
                     </a:stretch>
@@ -10493,7 +10493,7 @@
                     <pic:cNvPicPr/>
                   </pic:nvPicPr>
                   <pic:blipFill>
-                    <a:blip r:embed="rId11"/>
+                    <a:blip r:embed="rId13"/>
                     <a:stretch>
                       <a:fillRect/>
                     </a:stretch>
@@ -10599,7 +10599,7 @@
                     <pic:cNvPicPr/>
                   </pic:nvPicPr>
                   <pic:blipFill>
-                    <a:blip r:embed="rId12"/>
+                    <a:blip r:embed="rId14"/>
                     <a:stretch>
                       <a:fillRect/>
                     </a:stretch>
@@ -10674,7 +10674,7 @@
                     <pic:cNvPicPr/>
                   </pic:nvPicPr>
                   <pic:blipFill>
-                    <a:blip r:embed="rId13"/>
+                    <a:blip r:embed="rId15"/>
                     <a:stretch>
                       <a:fillRect/>
                     </a:stretch>
@@ -10749,7 +10749,7 @@
                     <pic:cNvPicPr/>
                   </pic:nvPicPr>
                   <pic:blipFill>
-                    <a:blip r:embed="rId9"/>
+                    <a:blip r:embed="rId12"/>
                     <a:stretch>
                       <a:fillRect/>
                     </a:stretch>
@@ -11892,7 +11892,7 @@
                     <pic:cNvPicPr/>
                   </pic:nvPicPr>
                   <pic:blipFill>
-                    <a:blip r:embed="rId9"/>
+                    <a:blip r:embed="rId12"/>
                     <a:stretch>
                       <a:fillRect/>
                     </a:stretch>
@@ -12024,7 +12024,7 @@
                     <pic:cNvPicPr/>
                   </pic:nvPicPr>
                   <pic:blipFill>
-                    <a:blip r:embed="rId9"/>
+                    <a:blip r:embed="rId12"/>
                     <a:stretch>
                       <a:fillRect/>
                     </a:stretch>
@@ -12247,7 +12247,7 @@
                     <pic:cNvPicPr/>
                   </pic:nvPicPr>
                   <pic:blipFill>
-                    <a:blip r:embed="rId9"/>
+                    <a:blip r:embed="rId12"/>
                     <a:stretch>
                       <a:fillRect/>
                     </a:stretch>
@@ -13316,7 +13316,7 @@
                     <pic:cNvPicPr/>
                   </pic:nvPicPr>
                   <pic:blipFill>
-                    <a:blip r:embed="rId9"/>
+                    <a:blip r:embed="rId12"/>
                     <a:stretch>
                       <a:fillRect/>
                     </a:stretch>

</xml_diff>

<commit_message>
Update project book with API flow and Defense pipeline diagrams
</commit_message>
<xml_diff>
--- a/AEGIS_SOC_Dashboard_Project_Book.docx
+++ b/AEGIS_SOC_Dashboard_Project_Book.docx
@@ -7902,7 +7902,7 @@
       <w:r>
         <w:drawing>
           <wp:inline xmlns:a="http://schemas.openxmlformats.org/drawingml/2006/main" xmlns:pic="http://schemas.openxmlformats.org/drawingml/2006/picture">
-            <wp:extent cx="5400000" cy="2700000"/>
+            <wp:extent cx="5400000" cy="2319231"/>
             <wp:docPr id="4" name="Picture 4"/>
             <wp:cNvGraphicFramePr>
               <a:graphicFrameLocks noChangeAspect="1"/>
@@ -7911,7 +7911,7 @@
               <a:graphicData uri="http://schemas.openxmlformats.org/drawingml/2006/picture">
                 <pic:pic>
                   <pic:nvPicPr>
-                    <pic:cNvPr id="0" name="placeholder.png"/>
+                    <pic:cNvPr id="0" name="api_flow.png"/>
                     <pic:cNvPicPr/>
                   </pic:nvPicPr>
                   <pic:blipFill>
@@ -7923,7 +7923,7 @@
                   <pic:spPr>
                     <a:xfrm>
                       <a:off x="0" y="0"/>
-                      <a:ext cx="5400000" cy="2700000"/>
+                      <a:ext cx="5400000" cy="2319231"/>
                     </a:xfrm>
                     <a:prstGeom prst="rect"/>
                   </pic:spPr>
@@ -10327,7 +10327,7 @@
                     <pic:cNvPicPr/>
                   </pic:nvPicPr>
                   <pic:blipFill>
-                    <a:blip r:embed="rId12"/>
+                    <a:blip r:embed="rId13"/>
                     <a:stretch>
                       <a:fillRect/>
                     </a:stretch>
@@ -10493,7 +10493,7 @@
                     <pic:cNvPicPr/>
                   </pic:nvPicPr>
                   <pic:blipFill>
-                    <a:blip r:embed="rId13"/>
+                    <a:blip r:embed="rId14"/>
                     <a:stretch>
                       <a:fillRect/>
                     </a:stretch>
@@ -10599,7 +10599,7 @@
                     <pic:cNvPicPr/>
                   </pic:nvPicPr>
                   <pic:blipFill>
-                    <a:blip r:embed="rId14"/>
+                    <a:blip r:embed="rId15"/>
                     <a:stretch>
                       <a:fillRect/>
                     </a:stretch>
@@ -10674,7 +10674,7 @@
                     <pic:cNvPicPr/>
                   </pic:nvPicPr>
                   <pic:blipFill>
-                    <a:blip r:embed="rId15"/>
+                    <a:blip r:embed="rId16"/>
                     <a:stretch>
                       <a:fillRect/>
                     </a:stretch>
@@ -10749,7 +10749,7 @@
                     <pic:cNvPicPr/>
                   </pic:nvPicPr>
                   <pic:blipFill>
-                    <a:blip r:embed="rId12"/>
+                    <a:blip r:embed="rId13"/>
                     <a:stretch>
                       <a:fillRect/>
                     </a:stretch>
@@ -11892,7 +11892,7 @@
                     <pic:cNvPicPr/>
                   </pic:nvPicPr>
                   <pic:blipFill>
-                    <a:blip r:embed="rId12"/>
+                    <a:blip r:embed="rId13"/>
                     <a:stretch>
                       <a:fillRect/>
                     </a:stretch>
@@ -12024,7 +12024,7 @@
                     <pic:cNvPicPr/>
                   </pic:nvPicPr>
                   <pic:blipFill>
-                    <a:blip r:embed="rId12"/>
+                    <a:blip r:embed="rId13"/>
                     <a:stretch>
                       <a:fillRect/>
                     </a:stretch>
@@ -12247,7 +12247,7 @@
                     <pic:cNvPicPr/>
                   </pic:nvPicPr>
                   <pic:blipFill>
-                    <a:blip r:embed="rId12"/>
+                    <a:blip r:embed="rId13"/>
                     <a:stretch>
                       <a:fillRect/>
                     </a:stretch>
@@ -13303,7 +13303,7 @@
       <w:r>
         <w:drawing>
           <wp:inline xmlns:a="http://schemas.openxmlformats.org/drawingml/2006/main" xmlns:pic="http://schemas.openxmlformats.org/drawingml/2006/picture">
-            <wp:extent cx="5400000" cy="2700000"/>
+            <wp:extent cx="5400000" cy="726923"/>
             <wp:docPr id="14" name="Picture 14"/>
             <wp:cNvGraphicFramePr>
               <a:graphicFrameLocks noChangeAspect="1"/>
@@ -13312,11 +13312,11 @@
               <a:graphicData uri="http://schemas.openxmlformats.org/drawingml/2006/picture">
                 <pic:pic>
                   <pic:nvPicPr>
-                    <pic:cNvPr id="0" name="placeholder.png"/>
+                    <pic:cNvPr id="0" name="defense_pipeline.png"/>
                     <pic:cNvPicPr/>
                   </pic:nvPicPr>
                   <pic:blipFill>
-                    <a:blip r:embed="rId12"/>
+                    <a:blip r:embed="rId17"/>
                     <a:stretch>
                       <a:fillRect/>
                     </a:stretch>
@@ -13324,7 +13324,7 @@
                   <pic:spPr>
                     <a:xfrm>
                       <a:off x="0" y="0"/>
-                      <a:ext cx="5400000" cy="2700000"/>
+                      <a:ext cx="5400000" cy="726923"/>
                     </a:xfrm>
                     <a:prstGeom prst="rect"/>
                   </pic:spPr>

</xml_diff>

<commit_message>
Update project book with Thread Architecture diagram
</commit_message>
<xml_diff>
--- a/AEGIS_SOC_Dashboard_Project_Book.docx
+++ b/AEGIS_SOC_Dashboard_Project_Book.docx
@@ -12234,7 +12234,7 @@
       <w:r>
         <w:drawing>
           <wp:inline xmlns:a="http://schemas.openxmlformats.org/drawingml/2006/main" xmlns:pic="http://schemas.openxmlformats.org/drawingml/2006/picture">
-            <wp:extent cx="5400000" cy="2700000"/>
+            <wp:extent cx="5400000" cy="990000"/>
             <wp:docPr id="13" name="Picture 13"/>
             <wp:cNvGraphicFramePr>
               <a:graphicFrameLocks noChangeAspect="1"/>
@@ -12243,11 +12243,11 @@
               <a:graphicData uri="http://schemas.openxmlformats.org/drawingml/2006/picture">
                 <pic:pic>
                   <pic:nvPicPr>
-                    <pic:cNvPr id="0" name="placeholder.png"/>
+                    <pic:cNvPr id="0" name="thread_arch.png"/>
                     <pic:cNvPicPr/>
                   </pic:nvPicPr>
                   <pic:blipFill>
-                    <a:blip r:embed="rId13"/>
+                    <a:blip r:embed="rId17"/>
                     <a:stretch>
                       <a:fillRect/>
                     </a:stretch>
@@ -12255,7 +12255,7 @@
                   <pic:spPr>
                     <a:xfrm>
                       <a:off x="0" y="0"/>
-                      <a:ext cx="5400000" cy="2700000"/>
+                      <a:ext cx="5400000" cy="990000"/>
                     </a:xfrm>
                     <a:prstGeom prst="rect"/>
                   </pic:spPr>
@@ -13316,7 +13316,7 @@
                     <pic:cNvPicPr/>
                   </pic:nvPicPr>
                   <pic:blipFill>
-                    <a:blip r:embed="rId17"/>
+                    <a:blip r:embed="rId18"/>
                     <a:stretch>
                       <a:fillRect/>
                     </a:stretch>

</xml_diff>

<commit_message>
Update project book with all figure placeholders clearly labeled
</commit_message>
<xml_diff>
--- a/AEGIS_SOC_Dashboard_Project_Book.docx
+++ b/AEGIS_SOC_Dashboard_Project_Book.docx
@@ -10323,7 +10323,7 @@
               <a:graphicData uri="http://schemas.openxmlformats.org/drawingml/2006/picture">
                 <pic:pic>
                   <pic:nvPicPr>
-                    <pic:cNvPr id="0" name="placeholder.png"/>
+                    <pic:cNvPr id="0" name="figure_4_2.png"/>
                     <pic:cNvPicPr/>
                   </pic:nvPicPr>
                   <pic:blipFill>
@@ -10745,11 +10745,11 @@
               <a:graphicData uri="http://schemas.openxmlformats.org/drawingml/2006/picture">
                 <pic:pic>
                   <pic:nvPicPr>
-                    <pic:cNvPr id="0" name="placeholder.png"/>
+                    <pic:cNvPr id="0" name="figure_4_3_4.png"/>
                     <pic:cNvPicPr/>
                   </pic:nvPicPr>
                   <pic:blipFill>
-                    <a:blip r:embed="rId13"/>
+                    <a:blip r:embed="rId17"/>
                     <a:stretch>
                       <a:fillRect/>
                     </a:stretch>
@@ -11888,11 +11888,11 @@
               <a:graphicData uri="http://schemas.openxmlformats.org/drawingml/2006/picture">
                 <pic:pic>
                   <pic:nvPicPr>
-                    <pic:cNvPr id="0" name="placeholder.png"/>
+                    <pic:cNvPr id="0" name="figure_4_5.png"/>
                     <pic:cNvPicPr/>
                   </pic:nvPicPr>
                   <pic:blipFill>
-                    <a:blip r:embed="rId13"/>
+                    <a:blip r:embed="rId18"/>
                     <a:stretch>
                       <a:fillRect/>
                     </a:stretch>
@@ -12020,11 +12020,11 @@
               <a:graphicData uri="http://schemas.openxmlformats.org/drawingml/2006/picture">
                 <pic:pic>
                   <pic:nvPicPr>
-                    <pic:cNvPr id="0" name="placeholder.png"/>
+                    <pic:cNvPr id="0" name="figure_4_6.png"/>
                     <pic:cNvPicPr/>
                   </pic:nvPicPr>
                   <pic:blipFill>
-                    <a:blip r:embed="rId13"/>
+                    <a:blip r:embed="rId19"/>
                     <a:stretch>
                       <a:fillRect/>
                     </a:stretch>
@@ -12247,7 +12247,7 @@
                     <pic:cNvPicPr/>
                   </pic:nvPicPr>
                   <pic:blipFill>
-                    <a:blip r:embed="rId17"/>
+                    <a:blip r:embed="rId20"/>
                     <a:stretch>
                       <a:fillRect/>
                     </a:stretch>
@@ -13316,7 +13316,7 @@
                     <pic:cNvPicPr/>
                   </pic:nvPicPr>
                   <pic:blipFill>
-                    <a:blip r:embed="rId18"/>
+                    <a:blip r:embed="rId21"/>
                     <a:stretch>
                       <a:fillRect/>
                     </a:stretch>
@@ -14792,6 +14792,59 @@
     <w:p/>
     <w:p>
       <w:pPr>
+        <w:jc w:val="center"/>
+      </w:pPr>
+      <w:r>
+        <w:drawing>
+          <wp:inline xmlns:a="http://schemas.openxmlformats.org/drawingml/2006/main" xmlns:pic="http://schemas.openxmlformats.org/drawingml/2006/picture">
+            <wp:extent cx="5400000" cy="2700000"/>
+            <wp:docPr id="15" name="Picture 15"/>
+            <wp:cNvGraphicFramePr>
+              <a:graphicFrameLocks noChangeAspect="1"/>
+            </wp:cNvGraphicFramePr>
+            <a:graphic>
+              <a:graphicData uri="http://schemas.openxmlformats.org/drawingml/2006/picture">
+                <pic:pic>
+                  <pic:nvPicPr>
+                    <pic:cNvPr id="0" name="figure_4_9.png"/>
+                    <pic:cNvPicPr/>
+                  </pic:nvPicPr>
+                  <pic:blipFill>
+                    <a:blip r:embed="rId22"/>
+                    <a:stretch>
+                      <a:fillRect/>
+                    </a:stretch>
+                  </pic:blipFill>
+                  <pic:spPr>
+                    <a:xfrm>
+                      <a:off x="0" y="0"/>
+                      <a:ext cx="5400000" cy="2700000"/>
+                    </a:xfrm>
+                    <a:prstGeom prst="rect"/>
+                  </pic:spPr>
+                </pic:pic>
+              </a:graphicData>
+            </a:graphic>
+          </wp:inline>
+        </w:drawing>
+      </w:r>
+    </w:p>
+    <w:p>
+      <w:pPr>
+        <w:spacing w:after="160"/>
+        <w:jc w:val="center"/>
+      </w:pPr>
+      <w:r>
+        <w:rPr>
+          <w:rFonts w:ascii="Times New Roman" w:hAnsi="Times New Roman"/>
+          <w:i/>
+          <w:sz w:val="20"/>
+        </w:rPr>
+        <w:t>Figure 4.9: AEGIS Dashboard — Main Overview Page</w:t>
+      </w:r>
+    </w:p>
+    <w:p>
+      <w:pPr>
         <w:pStyle w:val="Heading3"/>
         <w:spacing w:before="160" w:after="80"/>
       </w:pPr>
@@ -14898,6 +14951,59 @@
     </w:p>
     <w:p>
       <w:pPr>
+        <w:jc w:val="center"/>
+      </w:pPr>
+      <w:r>
+        <w:drawing>
+          <wp:inline xmlns:a="http://schemas.openxmlformats.org/drawingml/2006/main" xmlns:pic="http://schemas.openxmlformats.org/drawingml/2006/picture">
+            <wp:extent cx="5400000" cy="2700000"/>
+            <wp:docPr id="16" name="Picture 16"/>
+            <wp:cNvGraphicFramePr>
+              <a:graphicFrameLocks noChangeAspect="1"/>
+            </wp:cNvGraphicFramePr>
+            <a:graphic>
+              <a:graphicData uri="http://schemas.openxmlformats.org/drawingml/2006/picture">
+                <pic:pic>
+                  <pic:nvPicPr>
+                    <pic:cNvPr id="0" name="figure_4_10.png"/>
+                    <pic:cNvPicPr/>
+                  </pic:nvPicPr>
+                  <pic:blipFill>
+                    <a:blip r:embed="rId23"/>
+                    <a:stretch>
+                      <a:fillRect/>
+                    </a:stretch>
+                  </pic:blipFill>
+                  <pic:spPr>
+                    <a:xfrm>
+                      <a:off x="0" y="0"/>
+                      <a:ext cx="5400000" cy="2700000"/>
+                    </a:xfrm>
+                    <a:prstGeom prst="rect"/>
+                  </pic:spPr>
+                </pic:pic>
+              </a:graphicData>
+            </a:graphic>
+          </wp:inline>
+        </w:drawing>
+      </w:r>
+    </w:p>
+    <w:p>
+      <w:pPr>
+        <w:spacing w:after="160"/>
+        <w:jc w:val="center"/>
+      </w:pPr>
+      <w:r>
+        <w:rPr>
+          <w:rFonts w:ascii="Times New Roman" w:hAnsi="Times New Roman"/>
+          <w:i/>
+          <w:sz w:val="20"/>
+        </w:rPr>
+        <w:t>Figure 4.10: AEGIS Dashboard — Live Threat Map</w:t>
+      </w:r>
+    </w:p>
+    <w:p>
+      <w:pPr>
         <w:pStyle w:val="Heading3"/>
         <w:spacing w:before="160" w:after="80"/>
       </w:pPr>
@@ -14990,6 +15096,112 @@
     </w:p>
     <w:p>
       <w:pPr>
+        <w:jc w:val="center"/>
+      </w:pPr>
+      <w:r>
+        <w:drawing>
+          <wp:inline xmlns:a="http://schemas.openxmlformats.org/drawingml/2006/main" xmlns:pic="http://schemas.openxmlformats.org/drawingml/2006/picture">
+            <wp:extent cx="5400000" cy="2700000"/>
+            <wp:docPr id="17" name="Picture 17"/>
+            <wp:cNvGraphicFramePr>
+              <a:graphicFrameLocks noChangeAspect="1"/>
+            </wp:cNvGraphicFramePr>
+            <a:graphic>
+              <a:graphicData uri="http://schemas.openxmlformats.org/drawingml/2006/picture">
+                <pic:pic>
+                  <pic:nvPicPr>
+                    <pic:cNvPr id="0" name="figure_4_11.png"/>
+                    <pic:cNvPicPr/>
+                  </pic:nvPicPr>
+                  <pic:blipFill>
+                    <a:blip r:embed="rId24"/>
+                    <a:stretch>
+                      <a:fillRect/>
+                    </a:stretch>
+                  </pic:blipFill>
+                  <pic:spPr>
+                    <a:xfrm>
+                      <a:off x="0" y="0"/>
+                      <a:ext cx="5400000" cy="2700000"/>
+                    </a:xfrm>
+                    <a:prstGeom prst="rect"/>
+                  </pic:spPr>
+                </pic:pic>
+              </a:graphicData>
+            </a:graphic>
+          </wp:inline>
+        </w:drawing>
+      </w:r>
+    </w:p>
+    <w:p>
+      <w:pPr>
+        <w:spacing w:after="160"/>
+        <w:jc w:val="center"/>
+      </w:pPr>
+      <w:r>
+        <w:rPr>
+          <w:rFonts w:ascii="Times New Roman" w:hAnsi="Times New Roman"/>
+          <w:i/>
+          <w:sz w:val="20"/>
+        </w:rPr>
+        <w:t>Figure 4.11: AEGIS Dashboard — Defense Center Page</w:t>
+      </w:r>
+    </w:p>
+    <w:p>
+      <w:pPr>
+        <w:jc w:val="center"/>
+      </w:pPr>
+      <w:r>
+        <w:drawing>
+          <wp:inline xmlns:a="http://schemas.openxmlformats.org/drawingml/2006/main" xmlns:pic="http://schemas.openxmlformats.org/drawingml/2006/picture">
+            <wp:extent cx="5400000" cy="2700000"/>
+            <wp:docPr id="18" name="Picture 18"/>
+            <wp:cNvGraphicFramePr>
+              <a:graphicFrameLocks noChangeAspect="1"/>
+            </wp:cNvGraphicFramePr>
+            <a:graphic>
+              <a:graphicData uri="http://schemas.openxmlformats.org/drawingml/2006/picture">
+                <pic:pic>
+                  <pic:nvPicPr>
+                    <pic:cNvPr id="0" name="figure_4_12.png"/>
+                    <pic:cNvPicPr/>
+                  </pic:nvPicPr>
+                  <pic:blipFill>
+                    <a:blip r:embed="rId25"/>
+                    <a:stretch>
+                      <a:fillRect/>
+                    </a:stretch>
+                  </pic:blipFill>
+                  <pic:spPr>
+                    <a:xfrm>
+                      <a:off x="0" y="0"/>
+                      <a:ext cx="5400000" cy="2700000"/>
+                    </a:xfrm>
+                    <a:prstGeom prst="rect"/>
+                  </pic:spPr>
+                </pic:pic>
+              </a:graphicData>
+            </a:graphic>
+          </wp:inline>
+        </w:drawing>
+      </w:r>
+    </w:p>
+    <w:p>
+      <w:pPr>
+        <w:spacing w:after="160"/>
+        <w:jc w:val="center"/>
+      </w:pPr>
+      <w:r>
+        <w:rPr>
+          <w:rFonts w:ascii="Times New Roman" w:hAnsi="Times New Roman"/>
+          <w:i/>
+          <w:sz w:val="20"/>
+        </w:rPr>
+        <w:t>Figure 4.12: AEGIS Dashboard — Events Page with AI Analysis</w:t>
+      </w:r>
+    </w:p>
+    <w:p>
+      <w:pPr>
         <w:pStyle w:val="Heading3"/>
         <w:spacing w:before="160" w:after="80"/>
       </w:pPr>
@@ -15206,6 +15418,59 @@
     </w:p>
     <w:p>
       <w:pPr>
+        <w:jc w:val="center"/>
+      </w:pPr>
+      <w:r>
+        <w:drawing>
+          <wp:inline xmlns:a="http://schemas.openxmlformats.org/drawingml/2006/main" xmlns:pic="http://schemas.openxmlformats.org/drawingml/2006/picture">
+            <wp:extent cx="5400000" cy="2700000"/>
+            <wp:docPr id="19" name="Picture 19"/>
+            <wp:cNvGraphicFramePr>
+              <a:graphicFrameLocks noChangeAspect="1"/>
+            </wp:cNvGraphicFramePr>
+            <a:graphic>
+              <a:graphicData uri="http://schemas.openxmlformats.org/drawingml/2006/picture">
+                <pic:pic>
+                  <pic:nvPicPr>
+                    <pic:cNvPr id="0" name="figure_4_13.png"/>
+                    <pic:cNvPicPr/>
+                  </pic:nvPicPr>
+                  <pic:blipFill>
+                    <a:blip r:embed="rId26"/>
+                    <a:stretch>
+                      <a:fillRect/>
+                    </a:stretch>
+                  </pic:blipFill>
+                  <pic:spPr>
+                    <a:xfrm>
+                      <a:off x="0" y="0"/>
+                      <a:ext cx="5400000" cy="2700000"/>
+                    </a:xfrm>
+                    <a:prstGeom prst="rect"/>
+                  </pic:spPr>
+                </pic:pic>
+              </a:graphicData>
+            </a:graphic>
+          </wp:inline>
+        </w:drawing>
+      </w:r>
+    </w:p>
+    <w:p>
+      <w:pPr>
+        <w:spacing w:after="160"/>
+        <w:jc w:val="center"/>
+      </w:pPr>
+      <w:r>
+        <w:rPr>
+          <w:rFonts w:ascii="Times New Roman" w:hAnsi="Times New Roman"/>
+          <w:i/>
+          <w:sz w:val="20"/>
+        </w:rPr>
+        <w:t>Figure 4.13: AEGIS Dashboard — Reports Page</w:t>
+      </w:r>
+    </w:p>
+    <w:p>
+      <w:pPr>
         <w:pStyle w:val="Heading2"/>
         <w:spacing w:before="240" w:after="120"/>
       </w:pPr>
@@ -15263,6 +15528,59 @@
           <w:sz w:val="24"/>
         </w:rPr>
         <w:t>On the Threat Map, Telegram notifications are visualized as blue packets traveling from the AEGIS hub node to the Telegram node, providing visual confirmation that the alert was dispatched.</w:t>
+      </w:r>
+    </w:p>
+    <w:p>
+      <w:pPr>
+        <w:jc w:val="center"/>
+      </w:pPr>
+      <w:r>
+        <w:drawing>
+          <wp:inline xmlns:a="http://schemas.openxmlformats.org/drawingml/2006/main" xmlns:pic="http://schemas.openxmlformats.org/drawingml/2006/picture">
+            <wp:extent cx="5400000" cy="2700000"/>
+            <wp:docPr id="20" name="Picture 20"/>
+            <wp:cNvGraphicFramePr>
+              <a:graphicFrameLocks noChangeAspect="1"/>
+            </wp:cNvGraphicFramePr>
+            <a:graphic>
+              <a:graphicData uri="http://schemas.openxmlformats.org/drawingml/2006/picture">
+                <pic:pic>
+                  <pic:nvPicPr>
+                    <pic:cNvPr id="0" name="figure_4_14.png"/>
+                    <pic:cNvPicPr/>
+                  </pic:nvPicPr>
+                  <pic:blipFill>
+                    <a:blip r:embed="rId27"/>
+                    <a:stretch>
+                      <a:fillRect/>
+                    </a:stretch>
+                  </pic:blipFill>
+                  <pic:spPr>
+                    <a:xfrm>
+                      <a:off x="0" y="0"/>
+                      <a:ext cx="5400000" cy="2700000"/>
+                    </a:xfrm>
+                    <a:prstGeom prst="rect"/>
+                  </pic:spPr>
+                </pic:pic>
+              </a:graphicData>
+            </a:graphic>
+          </wp:inline>
+        </w:drawing>
+      </w:r>
+    </w:p>
+    <w:p>
+      <w:pPr>
+        <w:spacing w:after="160"/>
+        <w:jc w:val="center"/>
+      </w:pPr>
+      <w:r>
+        <w:rPr>
+          <w:rFonts w:ascii="Times New Roman" w:hAnsi="Times New Roman"/>
+          <w:i/>
+          <w:sz w:val="20"/>
+        </w:rPr>
+        <w:t>Figure 4.14: Telegram Notification Sample</w:t>
       </w:r>
     </w:p>
     <w:p>
@@ -16622,6 +16940,112 @@
     </w:p>
     <w:p>
       <w:pPr>
+        <w:jc w:val="center"/>
+      </w:pPr>
+      <w:r>
+        <w:drawing>
+          <wp:inline xmlns:a="http://schemas.openxmlformats.org/drawingml/2006/main" xmlns:pic="http://schemas.openxmlformats.org/drawingml/2006/picture">
+            <wp:extent cx="5400000" cy="2700000"/>
+            <wp:docPr id="21" name="Picture 21"/>
+            <wp:cNvGraphicFramePr>
+              <a:graphicFrameLocks noChangeAspect="1"/>
+            </wp:cNvGraphicFramePr>
+            <a:graphic>
+              <a:graphicData uri="http://schemas.openxmlformats.org/drawingml/2006/picture">
+                <pic:pic>
+                  <pic:nvPicPr>
+                    <pic:cNvPr id="0" name="figure_5_1.png"/>
+                    <pic:cNvPicPr/>
+                  </pic:nvPicPr>
+                  <pic:blipFill>
+                    <a:blip r:embed="rId28"/>
+                    <a:stretch>
+                      <a:fillRect/>
+                    </a:stretch>
+                  </pic:blipFill>
+                  <pic:spPr>
+                    <a:xfrm>
+                      <a:off x="0" y="0"/>
+                      <a:ext cx="5400000" cy="2700000"/>
+                    </a:xfrm>
+                    <a:prstGeom prst="rect"/>
+                  </pic:spPr>
+                </pic:pic>
+              </a:graphicData>
+            </a:graphic>
+          </wp:inline>
+        </w:drawing>
+      </w:r>
+    </w:p>
+    <w:p>
+      <w:pPr>
+        <w:spacing w:after="160"/>
+        <w:jc w:val="center"/>
+      </w:pPr>
+      <w:r>
+        <w:rPr>
+          <w:rFonts w:ascii="Times New Roman" w:hAnsi="Times New Roman"/>
+          <w:i/>
+          <w:sz w:val="20"/>
+        </w:rPr>
+        <w:t>Figure 5.1: Kali Linux Attack Execution — Hydra SSH Brute Force</w:t>
+      </w:r>
+    </w:p>
+    <w:p>
+      <w:pPr>
+        <w:jc w:val="center"/>
+      </w:pPr>
+      <w:r>
+        <w:drawing>
+          <wp:inline xmlns:a="http://schemas.openxmlformats.org/drawingml/2006/main" xmlns:pic="http://schemas.openxmlformats.org/drawingml/2006/picture">
+            <wp:extent cx="5400000" cy="2700000"/>
+            <wp:docPr id="22" name="Picture 22"/>
+            <wp:cNvGraphicFramePr>
+              <a:graphicFrameLocks noChangeAspect="1"/>
+            </wp:cNvGraphicFramePr>
+            <a:graphic>
+              <a:graphicData uri="http://schemas.openxmlformats.org/drawingml/2006/picture">
+                <pic:pic>
+                  <pic:nvPicPr>
+                    <pic:cNvPr id="0" name="figure_5_2.png"/>
+                    <pic:cNvPicPr/>
+                  </pic:nvPicPr>
+                  <pic:blipFill>
+                    <a:blip r:embed="rId29"/>
+                    <a:stretch>
+                      <a:fillRect/>
+                    </a:stretch>
+                  </pic:blipFill>
+                  <pic:spPr>
+                    <a:xfrm>
+                      <a:off x="0" y="0"/>
+                      <a:ext cx="5400000" cy="2700000"/>
+                    </a:xfrm>
+                    <a:prstGeom prst="rect"/>
+                  </pic:spPr>
+                </pic:pic>
+              </a:graphicData>
+            </a:graphic>
+          </wp:inline>
+        </w:drawing>
+      </w:r>
+    </w:p>
+    <w:p>
+      <w:pPr>
+        <w:spacing w:after="160"/>
+        <w:jc w:val="center"/>
+      </w:pPr>
+      <w:r>
+        <w:rPr>
+          <w:rFonts w:ascii="Times New Roman" w:hAnsi="Times New Roman"/>
+          <w:i/>
+          <w:sz w:val="20"/>
+        </w:rPr>
+        <w:t>Figure 5.2: AEGIS Dashboard — Brute Force Detection Alert</w:t>
+      </w:r>
+    </w:p>
+    <w:p>
+      <w:pPr>
         <w:pStyle w:val="Heading3"/>
         <w:spacing w:before="160" w:after="80"/>
       </w:pPr>
@@ -16657,6 +17081,59 @@
     </w:p>
     <w:p>
       <w:pPr>
+        <w:jc w:val="center"/>
+      </w:pPr>
+      <w:r>
+        <w:drawing>
+          <wp:inline xmlns:a="http://schemas.openxmlformats.org/drawingml/2006/main" xmlns:pic="http://schemas.openxmlformats.org/drawingml/2006/picture">
+            <wp:extent cx="5400000" cy="2700000"/>
+            <wp:docPr id="23" name="Picture 23"/>
+            <wp:cNvGraphicFramePr>
+              <a:graphicFrameLocks noChangeAspect="1"/>
+            </wp:cNvGraphicFramePr>
+            <a:graphic>
+              <a:graphicData uri="http://schemas.openxmlformats.org/drawingml/2006/picture">
+                <pic:pic>
+                  <pic:nvPicPr>
+                    <pic:cNvPr id="0" name="figure_5_3.png"/>
+                    <pic:cNvPicPr/>
+                  </pic:nvPicPr>
+                  <pic:blipFill>
+                    <a:blip r:embed="rId30"/>
+                    <a:stretch>
+                      <a:fillRect/>
+                    </a:stretch>
+                  </pic:blipFill>
+                  <pic:spPr>
+                    <a:xfrm>
+                      <a:off x="0" y="0"/>
+                      <a:ext cx="5400000" cy="2700000"/>
+                    </a:xfrm>
+                    <a:prstGeom prst="rect"/>
+                  </pic:spPr>
+                </pic:pic>
+              </a:graphicData>
+            </a:graphic>
+          </wp:inline>
+        </w:drawing>
+      </w:r>
+    </w:p>
+    <w:p>
+      <w:pPr>
+        <w:spacing w:after="160"/>
+        <w:jc w:val="center"/>
+      </w:pPr>
+      <w:r>
+        <w:rPr>
+          <w:rFonts w:ascii="Times New Roman" w:hAnsi="Times New Roman"/>
+          <w:i/>
+          <w:sz w:val="20"/>
+        </w:rPr>
+        <w:t>Figure 5.3: sqlmap SQL Injection Attack Result</w:t>
+      </w:r>
+    </w:p>
+    <w:p>
+      <w:pPr>
         <w:pStyle w:val="Heading3"/>
         <w:spacing w:before="160" w:after="80"/>
       </w:pPr>
@@ -16692,6 +17169,59 @@
     </w:p>
     <w:p>
       <w:pPr>
+        <w:jc w:val="center"/>
+      </w:pPr>
+      <w:r>
+        <w:drawing>
+          <wp:inline xmlns:a="http://schemas.openxmlformats.org/drawingml/2006/main" xmlns:pic="http://schemas.openxmlformats.org/drawingml/2006/picture">
+            <wp:extent cx="5400000" cy="2700000"/>
+            <wp:docPr id="24" name="Picture 24"/>
+            <wp:cNvGraphicFramePr>
+              <a:graphicFrameLocks noChangeAspect="1"/>
+            </wp:cNvGraphicFramePr>
+            <a:graphic>
+              <a:graphicData uri="http://schemas.openxmlformats.org/drawingml/2006/picture">
+                <pic:pic>
+                  <pic:nvPicPr>
+                    <pic:cNvPr id="0" name="figure_5_4.png"/>
+                    <pic:cNvPicPr/>
+                  </pic:nvPicPr>
+                  <pic:blipFill>
+                    <a:blip r:embed="rId31"/>
+                    <a:stretch>
+                      <a:fillRect/>
+                    </a:stretch>
+                  </pic:blipFill>
+                  <pic:spPr>
+                    <a:xfrm>
+                      <a:off x="0" y="0"/>
+                      <a:ext cx="5400000" cy="2700000"/>
+                    </a:xfrm>
+                    <a:prstGeom prst="rect"/>
+                  </pic:spPr>
+                </pic:pic>
+              </a:graphicData>
+            </a:graphic>
+          </wp:inline>
+        </w:drawing>
+      </w:r>
+    </w:p>
+    <w:p>
+      <w:pPr>
+        <w:spacing w:after="160"/>
+        <w:jc w:val="center"/>
+      </w:pPr>
+      <w:r>
+        <w:rPr>
+          <w:rFonts w:ascii="Times New Roman" w:hAnsi="Times New Roman"/>
+          <w:i/>
+          <w:sz w:val="20"/>
+        </w:rPr>
+        <w:t>Figure 5.4: hping3 DDoS Simulation — Apache Service Down</w:t>
+      </w:r>
+    </w:p>
+    <w:p>
+      <w:pPr>
         <w:pStyle w:val="Heading2"/>
         <w:spacing w:before="240" w:after="120"/>
       </w:pPr>
@@ -16710,6 +17240,59 @@
           <w:sz w:val="24"/>
         </w:rPr>
         <w:t>Auto-defense execution was validated by monitoring the defense_commands table and confirming iptables/pfctl rule changes on the target VMs:</w:t>
+      </w:r>
+    </w:p>
+    <w:p>
+      <w:pPr>
+        <w:jc w:val="center"/>
+      </w:pPr>
+      <w:r>
+        <w:drawing>
+          <wp:inline xmlns:a="http://schemas.openxmlformats.org/drawingml/2006/main" xmlns:pic="http://schemas.openxmlformats.org/drawingml/2006/picture">
+            <wp:extent cx="5400000" cy="2700000"/>
+            <wp:docPr id="25" name="Picture 25"/>
+            <wp:cNvGraphicFramePr>
+              <a:graphicFrameLocks noChangeAspect="1"/>
+            </wp:cNvGraphicFramePr>
+            <a:graphic>
+              <a:graphicData uri="http://schemas.openxmlformats.org/drawingml/2006/picture">
+                <pic:pic>
+                  <pic:nvPicPr>
+                    <pic:cNvPr id="0" name="figure_5_5.png"/>
+                    <pic:cNvPicPr/>
+                  </pic:nvPicPr>
+                  <pic:blipFill>
+                    <a:blip r:embed="rId32"/>
+                    <a:stretch>
+                      <a:fillRect/>
+                    </a:stretch>
+                  </pic:blipFill>
+                  <pic:spPr>
+                    <a:xfrm>
+                      <a:off x="0" y="0"/>
+                      <a:ext cx="5400000" cy="2700000"/>
+                    </a:xfrm>
+                    <a:prstGeom prst="rect"/>
+                  </pic:spPr>
+                </pic:pic>
+              </a:graphicData>
+            </a:graphic>
+          </wp:inline>
+        </w:drawing>
+      </w:r>
+    </w:p>
+    <w:p>
+      <w:pPr>
+        <w:spacing w:after="160"/>
+        <w:jc w:val="center"/>
+      </w:pPr>
+      <w:r>
+        <w:rPr>
+          <w:rFonts w:ascii="Times New Roman" w:hAnsi="Times New Roman"/>
+          <w:i/>
+          <w:sz w:val="20"/>
+        </w:rPr>
+        <w:t>Figure 5.5: Auto-Defense Command Queue — Pending/Executed</w:t>
       </w:r>
     </w:p>
     <w:tbl>

</xml_diff>